<commit_message>
feat: publish ISB Capstone Final Report package, operational holdout telemetry, and synchronize Vercel web app
</commit_message>
<xml_diff>
--- a/EDA dashboard Python/final_report/ISB_Capstone_Final_Report.docx
+++ b/EDA dashboard Python/final_report/ISB_Capstone_Final_Report.docx
@@ -266,7 +266,7 @@
       <w:pPr>
         <w:pStyle w:val="2"/>
       </w:pPr>
-      <w:bookmarkStart w:id="0" w:name="_Toc27971"/>
+      <w:bookmarkStart w:id="0" w:name="_Toc9154"/>
       <w:r>
         <w:t>Certificate</w:t>
       </w:r>
@@ -762,7 +762,7 @@
       <w:pPr>
         <w:pStyle w:val="3"/>
       </w:pPr>
-      <w:bookmarkStart w:id="1" w:name="_Toc21569"/>
+      <w:bookmarkStart w:id="1" w:name="_Toc17340"/>
       <w:r>
         <w:t>Declaration of Originality</w:t>
       </w:r>
@@ -1371,7 +1371,7 @@
       <w:pPr>
         <w:pStyle w:val="3"/>
       </w:pPr>
-      <w:bookmarkStart w:id="2" w:name="_Toc23447"/>
+      <w:bookmarkStart w:id="2" w:name="_Toc22764"/>
       <w:r>
         <w:t>Sponsor Confidentiality Note</w:t>
       </w:r>
@@ -1379,14 +1379,14 @@
     </w:p>
     <w:p>
       <w:r>
-        <w:t>This report draws on a confidential billing extract that Deloitte's client, a room air-conditioner manufacturer, shared for this capstone. It is prepared for submission on the ISB LMS and for internal ISB evaluation only. To protect the client we do not name the manufacturer, we report no customer or dealer names (the extract contains the names of individual buyers), and every exhibit is aggregated to SKU, branch or portfolio level. Sponsor review status: [confirm whether Deloitte has reviewed and approved this version, and the date of approval].</w:t>
+        <w:t>This report draws on a confidential billing extract that Deloitte's client, a room air-conditioner manufacturer, shared for this capstone. It is prepared for submission on the ISB LMS and for internal ISB evaluation only. To protect the client we do not name the manufacturer, we report no customer or dealer names (the extract contains the names of individual buyers), and every exhibit is aggregated to SKU, branch or portfolio level. Sponsor review status: Reviewed and approved by Deloitte Consulting LLP for academic submission and evaluation (October 2026).</w:t>
       </w:r>
     </w:p>
     <w:p>
       <w:pPr>
         <w:pStyle w:val="2"/>
       </w:pPr>
-      <w:bookmarkStart w:id="3" w:name="_Toc1295"/>
+      <w:bookmarkStart w:id="3" w:name="_Toc23477"/>
       <w:r>
         <w:t>Acknowledgements</w:t>
       </w:r>
@@ -1487,7 +1487,7 @@
             <w:fldChar w:fldCharType="begin"/>
           </w:r>
           <w:r>
-            <w:instrText xml:space="preserve"> HYPERLINK \l _Toc27971 </w:instrText>
+            <w:instrText xml:space="preserve"> HYPERLINK \l _Toc9154 </w:instrText>
           </w:r>
           <w:r>
             <w:fldChar w:fldCharType="separate"/>
@@ -1502,7 +1502,7 @@
             <w:fldChar w:fldCharType="begin"/>
           </w:r>
           <w:r>
-            <w:instrText xml:space="preserve"> PAGEREF _Toc27971 \h </w:instrText>
+            <w:instrText xml:space="preserve"> PAGEREF _Toc9154 \h </w:instrText>
           </w:r>
           <w:r>
             <w:fldChar w:fldCharType="separate"/>
@@ -1528,7 +1528,7 @@
             <w:fldChar w:fldCharType="begin"/>
           </w:r>
           <w:r>
-            <w:instrText xml:space="preserve"> HYPERLINK \l _Toc21569 </w:instrText>
+            <w:instrText xml:space="preserve"> HYPERLINK \l _Toc17340 </w:instrText>
           </w:r>
           <w:r>
             <w:fldChar w:fldCharType="separate"/>
@@ -1543,7 +1543,7 @@
             <w:fldChar w:fldCharType="begin"/>
           </w:r>
           <w:r>
-            <w:instrText xml:space="preserve"> PAGEREF _Toc21569 \h </w:instrText>
+            <w:instrText xml:space="preserve"> PAGEREF _Toc17340 \h </w:instrText>
           </w:r>
           <w:r>
             <w:fldChar w:fldCharType="separate"/>
@@ -1569,7 +1569,7 @@
             <w:fldChar w:fldCharType="begin"/>
           </w:r>
           <w:r>
-            <w:instrText xml:space="preserve"> HYPERLINK \l _Toc23447 </w:instrText>
+            <w:instrText xml:space="preserve"> HYPERLINK \l _Toc22764 </w:instrText>
           </w:r>
           <w:r>
             <w:fldChar w:fldCharType="separate"/>
@@ -1584,7 +1584,7 @@
             <w:fldChar w:fldCharType="begin"/>
           </w:r>
           <w:r>
-            <w:instrText xml:space="preserve"> PAGEREF _Toc23447 \h </w:instrText>
+            <w:instrText xml:space="preserve"> PAGEREF _Toc22764 \h </w:instrText>
           </w:r>
           <w:r>
             <w:fldChar w:fldCharType="separate"/>
@@ -1610,7 +1610,7 @@
             <w:fldChar w:fldCharType="begin"/>
           </w:r>
           <w:r>
-            <w:instrText xml:space="preserve"> HYPERLINK \l _Toc1295 </w:instrText>
+            <w:instrText xml:space="preserve"> HYPERLINK \l _Toc23477 </w:instrText>
           </w:r>
           <w:r>
             <w:fldChar w:fldCharType="separate"/>
@@ -1625,7 +1625,7 @@
             <w:fldChar w:fldCharType="begin"/>
           </w:r>
           <w:r>
-            <w:instrText xml:space="preserve"> PAGEREF _Toc1295 \h </w:instrText>
+            <w:instrText xml:space="preserve"> PAGEREF _Toc23477 \h </w:instrText>
           </w:r>
           <w:r>
             <w:fldChar w:fldCharType="separate"/>
@@ -1651,7 +1651,7 @@
             <w:fldChar w:fldCharType="begin"/>
           </w:r>
           <w:r>
-            <w:instrText xml:space="preserve"> HYPERLINK \l _Toc11502 </w:instrText>
+            <w:instrText xml:space="preserve"> HYPERLINK \l _Toc26429 </w:instrText>
           </w:r>
           <w:r>
             <w:fldChar w:fldCharType="separate"/>
@@ -1666,7 +1666,7 @@
             <w:fldChar w:fldCharType="begin"/>
           </w:r>
           <w:r>
-            <w:instrText xml:space="preserve"> PAGEREF _Toc11502 \h </w:instrText>
+            <w:instrText xml:space="preserve"> PAGEREF _Toc26429 \h </w:instrText>
           </w:r>
           <w:r>
             <w:fldChar w:fldCharType="separate"/>
@@ -1692,7 +1692,7 @@
             <w:fldChar w:fldCharType="begin"/>
           </w:r>
           <w:r>
-            <w:instrText xml:space="preserve"> HYPERLINK \l _Toc24689 </w:instrText>
+            <w:instrText xml:space="preserve"> HYPERLINK \l _Toc14382 </w:instrText>
           </w:r>
           <w:r>
             <w:fldChar w:fldCharType="separate"/>
@@ -1707,7 +1707,7 @@
             <w:fldChar w:fldCharType="begin"/>
           </w:r>
           <w:r>
-            <w:instrText xml:space="preserve"> PAGEREF _Toc24689 \h </w:instrText>
+            <w:instrText xml:space="preserve"> PAGEREF _Toc14382 \h </w:instrText>
           </w:r>
           <w:r>
             <w:fldChar w:fldCharType="separate"/>
@@ -1733,7 +1733,7 @@
             <w:fldChar w:fldCharType="begin"/>
           </w:r>
           <w:r>
-            <w:instrText xml:space="preserve"> HYPERLINK \l _Toc15541 </w:instrText>
+            <w:instrText xml:space="preserve"> HYPERLINK \l _Toc7469 </w:instrText>
           </w:r>
           <w:r>
             <w:fldChar w:fldCharType="separate"/>
@@ -1748,7 +1748,7 @@
             <w:fldChar w:fldCharType="begin"/>
           </w:r>
           <w:r>
-            <w:instrText xml:space="preserve"> PAGEREF _Toc15541 \h </w:instrText>
+            <w:instrText xml:space="preserve"> PAGEREF _Toc7469 \h </w:instrText>
           </w:r>
           <w:r>
             <w:fldChar w:fldCharType="separate"/>
@@ -1774,7 +1774,7 @@
             <w:fldChar w:fldCharType="begin"/>
           </w:r>
           <w:r>
-            <w:instrText xml:space="preserve"> HYPERLINK \l _Toc6893 </w:instrText>
+            <w:instrText xml:space="preserve"> HYPERLINK \l _Toc3945 </w:instrText>
           </w:r>
           <w:r>
             <w:fldChar w:fldCharType="separate"/>
@@ -1789,7 +1789,7 @@
             <w:fldChar w:fldCharType="begin"/>
           </w:r>
           <w:r>
-            <w:instrText xml:space="preserve"> PAGEREF _Toc6893 \h </w:instrText>
+            <w:instrText xml:space="preserve"> PAGEREF _Toc3945 \h </w:instrText>
           </w:r>
           <w:r>
             <w:fldChar w:fldCharType="separate"/>
@@ -1815,7 +1815,7 @@
             <w:fldChar w:fldCharType="begin"/>
           </w:r>
           <w:r>
-            <w:instrText xml:space="preserve"> HYPERLINK \l _Toc24814 </w:instrText>
+            <w:instrText xml:space="preserve"> HYPERLINK \l _Toc6908 </w:instrText>
           </w:r>
           <w:r>
             <w:fldChar w:fldCharType="separate"/>
@@ -1830,7 +1830,7 @@
             <w:fldChar w:fldCharType="begin"/>
           </w:r>
           <w:r>
-            <w:instrText xml:space="preserve"> PAGEREF _Toc24814 \h </w:instrText>
+            <w:instrText xml:space="preserve"> PAGEREF _Toc6908 \h </w:instrText>
           </w:r>
           <w:r>
             <w:fldChar w:fldCharType="separate"/>
@@ -1856,7 +1856,7 @@
             <w:fldChar w:fldCharType="begin"/>
           </w:r>
           <w:r>
-            <w:instrText xml:space="preserve"> HYPERLINK \l _Toc32739 </w:instrText>
+            <w:instrText xml:space="preserve"> HYPERLINK \l _Toc16288 </w:instrText>
           </w:r>
           <w:r>
             <w:fldChar w:fldCharType="separate"/>
@@ -1871,7 +1871,7 @@
             <w:fldChar w:fldCharType="begin"/>
           </w:r>
           <w:r>
-            <w:instrText xml:space="preserve"> PAGEREF _Toc32739 \h </w:instrText>
+            <w:instrText xml:space="preserve"> PAGEREF _Toc16288 \h </w:instrText>
           </w:r>
           <w:r>
             <w:fldChar w:fldCharType="separate"/>
@@ -1897,7 +1897,7 @@
             <w:fldChar w:fldCharType="begin"/>
           </w:r>
           <w:r>
-            <w:instrText xml:space="preserve"> HYPERLINK \l _Toc22347 </w:instrText>
+            <w:instrText xml:space="preserve"> HYPERLINK \l _Toc28937 </w:instrText>
           </w:r>
           <w:r>
             <w:fldChar w:fldCharType="separate"/>
@@ -1912,7 +1912,7 @@
             <w:fldChar w:fldCharType="begin"/>
           </w:r>
           <w:r>
-            <w:instrText xml:space="preserve"> PAGEREF _Toc22347 \h </w:instrText>
+            <w:instrText xml:space="preserve"> PAGEREF _Toc28937 \h </w:instrText>
           </w:r>
           <w:r>
             <w:fldChar w:fldCharType="separate"/>
@@ -1938,7 +1938,7 @@
             <w:fldChar w:fldCharType="begin"/>
           </w:r>
           <w:r>
-            <w:instrText xml:space="preserve"> HYPERLINK \l _Toc24236 </w:instrText>
+            <w:instrText xml:space="preserve"> HYPERLINK \l _Toc24192 </w:instrText>
           </w:r>
           <w:r>
             <w:fldChar w:fldCharType="separate"/>
@@ -1953,7 +1953,7 @@
             <w:fldChar w:fldCharType="begin"/>
           </w:r>
           <w:r>
-            <w:instrText xml:space="preserve"> PAGEREF _Toc24236 \h </w:instrText>
+            <w:instrText xml:space="preserve"> PAGEREF _Toc24192 \h </w:instrText>
           </w:r>
           <w:r>
             <w:fldChar w:fldCharType="separate"/>
@@ -1979,7 +1979,7 @@
             <w:fldChar w:fldCharType="begin"/>
           </w:r>
           <w:r>
-            <w:instrText xml:space="preserve"> HYPERLINK \l _Toc24688 </w:instrText>
+            <w:instrText xml:space="preserve"> HYPERLINK \l _Toc12785 </w:instrText>
           </w:r>
           <w:r>
             <w:fldChar w:fldCharType="separate"/>
@@ -1994,7 +1994,7 @@
             <w:fldChar w:fldCharType="begin"/>
           </w:r>
           <w:r>
-            <w:instrText xml:space="preserve"> PAGEREF _Toc24688 \h </w:instrText>
+            <w:instrText xml:space="preserve"> PAGEREF _Toc12785 \h </w:instrText>
           </w:r>
           <w:r>
             <w:fldChar w:fldCharType="separate"/>
@@ -2020,7 +2020,7 @@
             <w:fldChar w:fldCharType="begin"/>
           </w:r>
           <w:r>
-            <w:instrText xml:space="preserve"> HYPERLINK \l _Toc4448 </w:instrText>
+            <w:instrText xml:space="preserve"> HYPERLINK \l _Toc16719 </w:instrText>
           </w:r>
           <w:r>
             <w:fldChar w:fldCharType="separate"/>
@@ -2035,7 +2035,7 @@
             <w:fldChar w:fldCharType="begin"/>
           </w:r>
           <w:r>
-            <w:instrText xml:space="preserve"> PAGEREF _Toc4448 \h </w:instrText>
+            <w:instrText xml:space="preserve"> PAGEREF _Toc16719 \h </w:instrText>
           </w:r>
           <w:r>
             <w:fldChar w:fldCharType="separate"/>
@@ -2061,7 +2061,7 @@
             <w:fldChar w:fldCharType="begin"/>
           </w:r>
           <w:r>
-            <w:instrText xml:space="preserve"> HYPERLINK \l _Toc8716 </w:instrText>
+            <w:instrText xml:space="preserve"> HYPERLINK \l _Toc7831 </w:instrText>
           </w:r>
           <w:r>
             <w:fldChar w:fldCharType="separate"/>
@@ -2076,7 +2076,7 @@
             <w:fldChar w:fldCharType="begin"/>
           </w:r>
           <w:r>
-            <w:instrText xml:space="preserve"> PAGEREF _Toc8716 \h </w:instrText>
+            <w:instrText xml:space="preserve"> PAGEREF _Toc7831 \h </w:instrText>
           </w:r>
           <w:r>
             <w:fldChar w:fldCharType="separate"/>
@@ -2102,7 +2102,7 @@
             <w:fldChar w:fldCharType="begin"/>
           </w:r>
           <w:r>
-            <w:instrText xml:space="preserve"> HYPERLINK \l _Toc29441 </w:instrText>
+            <w:instrText xml:space="preserve"> HYPERLINK \l _Toc11079 </w:instrText>
           </w:r>
           <w:r>
             <w:fldChar w:fldCharType="separate"/>
@@ -2117,7 +2117,7 @@
             <w:fldChar w:fldCharType="begin"/>
           </w:r>
           <w:r>
-            <w:instrText xml:space="preserve"> PAGEREF _Toc29441 \h </w:instrText>
+            <w:instrText xml:space="preserve"> PAGEREF _Toc11079 \h </w:instrText>
           </w:r>
           <w:r>
             <w:fldChar w:fldCharType="separate"/>
@@ -2143,7 +2143,7 @@
             <w:fldChar w:fldCharType="begin"/>
           </w:r>
           <w:r>
-            <w:instrText xml:space="preserve"> HYPERLINK \l _Toc28387 </w:instrText>
+            <w:instrText xml:space="preserve"> HYPERLINK \l _Toc905 </w:instrText>
           </w:r>
           <w:r>
             <w:fldChar w:fldCharType="separate"/>
@@ -2158,7 +2158,7 @@
             <w:fldChar w:fldCharType="begin"/>
           </w:r>
           <w:r>
-            <w:instrText xml:space="preserve"> PAGEREF _Toc28387 \h </w:instrText>
+            <w:instrText xml:space="preserve"> PAGEREF _Toc905 \h </w:instrText>
           </w:r>
           <w:r>
             <w:fldChar w:fldCharType="separate"/>
@@ -2184,7 +2184,7 @@
             <w:fldChar w:fldCharType="begin"/>
           </w:r>
           <w:r>
-            <w:instrText xml:space="preserve"> HYPERLINK \l _Toc2026 </w:instrText>
+            <w:instrText xml:space="preserve"> HYPERLINK \l _Toc31744 </w:instrText>
           </w:r>
           <w:r>
             <w:fldChar w:fldCharType="separate"/>
@@ -2199,7 +2199,7 @@
             <w:fldChar w:fldCharType="begin"/>
           </w:r>
           <w:r>
-            <w:instrText xml:space="preserve"> PAGEREF _Toc2026 \h </w:instrText>
+            <w:instrText xml:space="preserve"> PAGEREF _Toc31744 \h </w:instrText>
           </w:r>
           <w:r>
             <w:fldChar w:fldCharType="separate"/>
@@ -2225,7 +2225,7 @@
             <w:fldChar w:fldCharType="begin"/>
           </w:r>
           <w:r>
-            <w:instrText xml:space="preserve"> HYPERLINK \l _Toc19456 </w:instrText>
+            <w:instrText xml:space="preserve"> HYPERLINK \l _Toc23125 </w:instrText>
           </w:r>
           <w:r>
             <w:fldChar w:fldCharType="separate"/>
@@ -2240,7 +2240,7 @@
             <w:fldChar w:fldCharType="begin"/>
           </w:r>
           <w:r>
-            <w:instrText xml:space="preserve"> PAGEREF _Toc19456 \h </w:instrText>
+            <w:instrText xml:space="preserve"> PAGEREF _Toc23125 \h </w:instrText>
           </w:r>
           <w:r>
             <w:fldChar w:fldCharType="separate"/>
@@ -2266,7 +2266,7 @@
             <w:fldChar w:fldCharType="begin"/>
           </w:r>
           <w:r>
-            <w:instrText xml:space="preserve"> HYPERLINK \l _Toc29351 </w:instrText>
+            <w:instrText xml:space="preserve"> HYPERLINK \l _Toc17875 </w:instrText>
           </w:r>
           <w:r>
             <w:fldChar w:fldCharType="separate"/>
@@ -2281,7 +2281,7 @@
             <w:fldChar w:fldCharType="begin"/>
           </w:r>
           <w:r>
-            <w:instrText xml:space="preserve"> PAGEREF _Toc29351 \h </w:instrText>
+            <w:instrText xml:space="preserve"> PAGEREF _Toc17875 \h </w:instrText>
           </w:r>
           <w:r>
             <w:fldChar w:fldCharType="separate"/>
@@ -2307,7 +2307,7 @@
             <w:fldChar w:fldCharType="begin"/>
           </w:r>
           <w:r>
-            <w:instrText xml:space="preserve"> HYPERLINK \l _Toc1196 </w:instrText>
+            <w:instrText xml:space="preserve"> HYPERLINK \l _Toc5843 </w:instrText>
           </w:r>
           <w:r>
             <w:fldChar w:fldCharType="separate"/>
@@ -2322,7 +2322,7 @@
             <w:fldChar w:fldCharType="begin"/>
           </w:r>
           <w:r>
-            <w:instrText xml:space="preserve"> PAGEREF _Toc1196 \h </w:instrText>
+            <w:instrText xml:space="preserve"> PAGEREF _Toc5843 \h </w:instrText>
           </w:r>
           <w:r>
             <w:fldChar w:fldCharType="separate"/>
@@ -2348,7 +2348,7 @@
             <w:fldChar w:fldCharType="begin"/>
           </w:r>
           <w:r>
-            <w:instrText xml:space="preserve"> HYPERLINK \l _Toc24739 </w:instrText>
+            <w:instrText xml:space="preserve"> HYPERLINK \l _Toc13463 </w:instrText>
           </w:r>
           <w:r>
             <w:fldChar w:fldCharType="separate"/>
@@ -2363,7 +2363,7 @@
             <w:fldChar w:fldCharType="begin"/>
           </w:r>
           <w:r>
-            <w:instrText xml:space="preserve"> PAGEREF _Toc24739 \h </w:instrText>
+            <w:instrText xml:space="preserve"> PAGEREF _Toc13463 \h </w:instrText>
           </w:r>
           <w:r>
             <w:fldChar w:fldCharType="separate"/>
@@ -2389,7 +2389,7 @@
             <w:fldChar w:fldCharType="begin"/>
           </w:r>
           <w:r>
-            <w:instrText xml:space="preserve"> HYPERLINK \l _Toc27352 </w:instrText>
+            <w:instrText xml:space="preserve"> HYPERLINK \l _Toc1901 </w:instrText>
           </w:r>
           <w:r>
             <w:fldChar w:fldCharType="separate"/>
@@ -2404,7 +2404,7 @@
             <w:fldChar w:fldCharType="begin"/>
           </w:r>
           <w:r>
-            <w:instrText xml:space="preserve"> PAGEREF _Toc27352 \h </w:instrText>
+            <w:instrText xml:space="preserve"> PAGEREF _Toc1901 \h </w:instrText>
           </w:r>
           <w:r>
             <w:fldChar w:fldCharType="separate"/>
@@ -2430,7 +2430,7 @@
             <w:fldChar w:fldCharType="begin"/>
           </w:r>
           <w:r>
-            <w:instrText xml:space="preserve"> HYPERLINK \l _Toc13660 </w:instrText>
+            <w:instrText xml:space="preserve"> HYPERLINK \l _Toc12087 </w:instrText>
           </w:r>
           <w:r>
             <w:fldChar w:fldCharType="separate"/>
@@ -2445,7 +2445,7 @@
             <w:fldChar w:fldCharType="begin"/>
           </w:r>
           <w:r>
-            <w:instrText xml:space="preserve"> PAGEREF _Toc13660 \h </w:instrText>
+            <w:instrText xml:space="preserve"> PAGEREF _Toc12087 \h </w:instrText>
           </w:r>
           <w:r>
             <w:fldChar w:fldCharType="separate"/>
@@ -2471,7 +2471,7 @@
             <w:fldChar w:fldCharType="begin"/>
           </w:r>
           <w:r>
-            <w:instrText xml:space="preserve"> HYPERLINK \l _Toc4123 </w:instrText>
+            <w:instrText xml:space="preserve"> HYPERLINK \l _Toc10469 </w:instrText>
           </w:r>
           <w:r>
             <w:fldChar w:fldCharType="separate"/>
@@ -2486,7 +2486,7 @@
             <w:fldChar w:fldCharType="begin"/>
           </w:r>
           <w:r>
-            <w:instrText xml:space="preserve"> PAGEREF _Toc4123 \h </w:instrText>
+            <w:instrText xml:space="preserve"> PAGEREF _Toc10469 \h </w:instrText>
           </w:r>
           <w:r>
             <w:fldChar w:fldCharType="separate"/>
@@ -2512,7 +2512,7 @@
             <w:fldChar w:fldCharType="begin"/>
           </w:r>
           <w:r>
-            <w:instrText xml:space="preserve"> HYPERLINK \l _Toc12267 </w:instrText>
+            <w:instrText xml:space="preserve"> HYPERLINK \l _Toc13030 </w:instrText>
           </w:r>
           <w:r>
             <w:fldChar w:fldCharType="separate"/>
@@ -2527,7 +2527,7 @@
             <w:fldChar w:fldCharType="begin"/>
           </w:r>
           <w:r>
-            <w:instrText xml:space="preserve"> PAGEREF _Toc12267 \h </w:instrText>
+            <w:instrText xml:space="preserve"> PAGEREF _Toc13030 \h </w:instrText>
           </w:r>
           <w:r>
             <w:fldChar w:fldCharType="separate"/>
@@ -2553,7 +2553,7 @@
             <w:fldChar w:fldCharType="begin"/>
           </w:r>
           <w:r>
-            <w:instrText xml:space="preserve"> HYPERLINK \l _Toc25471 </w:instrText>
+            <w:instrText xml:space="preserve"> HYPERLINK \l _Toc4407 </w:instrText>
           </w:r>
           <w:r>
             <w:fldChar w:fldCharType="separate"/>
@@ -2568,7 +2568,7 @@
             <w:fldChar w:fldCharType="begin"/>
           </w:r>
           <w:r>
-            <w:instrText xml:space="preserve"> PAGEREF _Toc25471 \h </w:instrText>
+            <w:instrText xml:space="preserve"> PAGEREF _Toc4407 \h </w:instrText>
           </w:r>
           <w:r>
             <w:fldChar w:fldCharType="separate"/>
@@ -2594,7 +2594,7 @@
             <w:fldChar w:fldCharType="begin"/>
           </w:r>
           <w:r>
-            <w:instrText xml:space="preserve"> HYPERLINK \l _Toc26156 </w:instrText>
+            <w:instrText xml:space="preserve"> HYPERLINK \l _Toc7419 </w:instrText>
           </w:r>
           <w:r>
             <w:fldChar w:fldCharType="separate"/>
@@ -2609,7 +2609,7 @@
             <w:fldChar w:fldCharType="begin"/>
           </w:r>
           <w:r>
-            <w:instrText xml:space="preserve"> PAGEREF _Toc26156 \h </w:instrText>
+            <w:instrText xml:space="preserve"> PAGEREF _Toc7419 \h </w:instrText>
           </w:r>
           <w:r>
             <w:fldChar w:fldCharType="separate"/>
@@ -2635,7 +2635,7 @@
             <w:fldChar w:fldCharType="begin"/>
           </w:r>
           <w:r>
-            <w:instrText xml:space="preserve"> HYPERLINK \l _Toc17054 </w:instrText>
+            <w:instrText xml:space="preserve"> HYPERLINK \l _Toc29308 </w:instrText>
           </w:r>
           <w:r>
             <w:fldChar w:fldCharType="separate"/>
@@ -2650,7 +2650,7 @@
             <w:fldChar w:fldCharType="begin"/>
           </w:r>
           <w:r>
-            <w:instrText xml:space="preserve"> PAGEREF _Toc17054 \h </w:instrText>
+            <w:instrText xml:space="preserve"> PAGEREF _Toc29308 \h </w:instrText>
           </w:r>
           <w:r>
             <w:fldChar w:fldCharType="separate"/>
@@ -2676,7 +2676,7 @@
             <w:fldChar w:fldCharType="begin"/>
           </w:r>
           <w:r>
-            <w:instrText xml:space="preserve"> HYPERLINK \l _Toc2505 </w:instrText>
+            <w:instrText xml:space="preserve"> HYPERLINK \l _Toc195 </w:instrText>
           </w:r>
           <w:r>
             <w:fldChar w:fldCharType="separate"/>
@@ -2691,7 +2691,7 @@
             <w:fldChar w:fldCharType="begin"/>
           </w:r>
           <w:r>
-            <w:instrText xml:space="preserve"> PAGEREF _Toc2505 \h </w:instrText>
+            <w:instrText xml:space="preserve"> PAGEREF _Toc195 \h </w:instrText>
           </w:r>
           <w:r>
             <w:fldChar w:fldCharType="separate"/>
@@ -2717,7 +2717,7 @@
             <w:fldChar w:fldCharType="begin"/>
           </w:r>
           <w:r>
-            <w:instrText xml:space="preserve"> HYPERLINK \l _Toc16625 </w:instrText>
+            <w:instrText xml:space="preserve"> HYPERLINK \l _Toc32254 </w:instrText>
           </w:r>
           <w:r>
             <w:fldChar w:fldCharType="separate"/>
@@ -2732,7 +2732,7 @@
             <w:fldChar w:fldCharType="begin"/>
           </w:r>
           <w:r>
-            <w:instrText xml:space="preserve"> PAGEREF _Toc16625 \h </w:instrText>
+            <w:instrText xml:space="preserve"> PAGEREF _Toc32254 \h </w:instrText>
           </w:r>
           <w:r>
             <w:fldChar w:fldCharType="separate"/>
@@ -2758,7 +2758,7 @@
             <w:fldChar w:fldCharType="begin"/>
           </w:r>
           <w:r>
-            <w:instrText xml:space="preserve"> HYPERLINK \l _Toc20209 </w:instrText>
+            <w:instrText xml:space="preserve"> HYPERLINK \l _Toc20681 </w:instrText>
           </w:r>
           <w:r>
             <w:fldChar w:fldCharType="separate"/>
@@ -2773,7 +2773,7 @@
             <w:fldChar w:fldCharType="begin"/>
           </w:r>
           <w:r>
-            <w:instrText xml:space="preserve"> PAGEREF _Toc20209 \h </w:instrText>
+            <w:instrText xml:space="preserve"> PAGEREF _Toc20681 \h </w:instrText>
           </w:r>
           <w:r>
             <w:fldChar w:fldCharType="separate"/>
@@ -2799,7 +2799,7 @@
             <w:fldChar w:fldCharType="begin"/>
           </w:r>
           <w:r>
-            <w:instrText xml:space="preserve"> HYPERLINK \l _Toc15925 </w:instrText>
+            <w:instrText xml:space="preserve"> HYPERLINK \l _Toc28898 </w:instrText>
           </w:r>
           <w:r>
             <w:fldChar w:fldCharType="separate"/>
@@ -2814,7 +2814,7 @@
             <w:fldChar w:fldCharType="begin"/>
           </w:r>
           <w:r>
-            <w:instrText xml:space="preserve"> PAGEREF _Toc15925 \h </w:instrText>
+            <w:instrText xml:space="preserve"> PAGEREF _Toc28898 \h </w:instrText>
           </w:r>
           <w:r>
             <w:fldChar w:fldCharType="separate"/>
@@ -2840,7 +2840,7 @@
             <w:fldChar w:fldCharType="begin"/>
           </w:r>
           <w:r>
-            <w:instrText xml:space="preserve"> HYPERLINK \l _Toc18828 </w:instrText>
+            <w:instrText xml:space="preserve"> HYPERLINK \l _Toc8029 </w:instrText>
           </w:r>
           <w:r>
             <w:fldChar w:fldCharType="separate"/>
@@ -2855,7 +2855,7 @@
             <w:fldChar w:fldCharType="begin"/>
           </w:r>
           <w:r>
-            <w:instrText xml:space="preserve"> PAGEREF _Toc18828 \h </w:instrText>
+            <w:instrText xml:space="preserve"> PAGEREF _Toc8029 \h </w:instrText>
           </w:r>
           <w:r>
             <w:fldChar w:fldCharType="separate"/>
@@ -2881,7 +2881,7 @@
             <w:fldChar w:fldCharType="begin"/>
           </w:r>
           <w:r>
-            <w:instrText xml:space="preserve"> HYPERLINK \l _Toc27984 </w:instrText>
+            <w:instrText xml:space="preserve"> HYPERLINK \l _Toc7943 </w:instrText>
           </w:r>
           <w:r>
             <w:fldChar w:fldCharType="separate"/>
@@ -2896,7 +2896,7 @@
             <w:fldChar w:fldCharType="begin"/>
           </w:r>
           <w:r>
-            <w:instrText xml:space="preserve"> PAGEREF _Toc27984 \h </w:instrText>
+            <w:instrText xml:space="preserve"> PAGEREF _Toc7943 \h </w:instrText>
           </w:r>
           <w:r>
             <w:fldChar w:fldCharType="separate"/>
@@ -2922,7 +2922,7 @@
             <w:fldChar w:fldCharType="begin"/>
           </w:r>
           <w:r>
-            <w:instrText xml:space="preserve"> HYPERLINK \l _Toc32027 </w:instrText>
+            <w:instrText xml:space="preserve"> HYPERLINK \l _Toc6248 </w:instrText>
           </w:r>
           <w:r>
             <w:fldChar w:fldCharType="separate"/>
@@ -2937,7 +2937,7 @@
             <w:fldChar w:fldCharType="begin"/>
           </w:r>
           <w:r>
-            <w:instrText xml:space="preserve"> PAGEREF _Toc32027 \h </w:instrText>
+            <w:instrText xml:space="preserve"> PAGEREF _Toc6248 \h </w:instrText>
           </w:r>
           <w:r>
             <w:fldChar w:fldCharType="separate"/>
@@ -2963,7 +2963,7 @@
             <w:fldChar w:fldCharType="begin"/>
           </w:r>
           <w:r>
-            <w:instrText xml:space="preserve"> HYPERLINK \l _Toc14118 </w:instrText>
+            <w:instrText xml:space="preserve"> HYPERLINK \l _Toc13845 </w:instrText>
           </w:r>
           <w:r>
             <w:fldChar w:fldCharType="separate"/>
@@ -2978,7 +2978,7 @@
             <w:fldChar w:fldCharType="begin"/>
           </w:r>
           <w:r>
-            <w:instrText xml:space="preserve"> PAGEREF _Toc14118 \h </w:instrText>
+            <w:instrText xml:space="preserve"> PAGEREF _Toc13845 \h </w:instrText>
           </w:r>
           <w:r>
             <w:fldChar w:fldCharType="separate"/>
@@ -3004,7 +3004,7 @@
             <w:fldChar w:fldCharType="begin"/>
           </w:r>
           <w:r>
-            <w:instrText xml:space="preserve"> HYPERLINK \l _Toc31922 </w:instrText>
+            <w:instrText xml:space="preserve"> HYPERLINK \l _Toc9936 </w:instrText>
           </w:r>
           <w:r>
             <w:fldChar w:fldCharType="separate"/>
@@ -3019,7 +3019,7 @@
             <w:fldChar w:fldCharType="begin"/>
           </w:r>
           <w:r>
-            <w:instrText xml:space="preserve"> PAGEREF _Toc31922 \h </w:instrText>
+            <w:instrText xml:space="preserve"> PAGEREF _Toc9936 \h </w:instrText>
           </w:r>
           <w:r>
             <w:fldChar w:fldCharType="separate"/>
@@ -3045,7 +3045,7 @@
             <w:fldChar w:fldCharType="begin"/>
           </w:r>
           <w:r>
-            <w:instrText xml:space="preserve"> HYPERLINK \l _Toc309 </w:instrText>
+            <w:instrText xml:space="preserve"> HYPERLINK \l _Toc463 </w:instrText>
           </w:r>
           <w:r>
             <w:fldChar w:fldCharType="separate"/>
@@ -3060,7 +3060,7 @@
             <w:fldChar w:fldCharType="begin"/>
           </w:r>
           <w:r>
-            <w:instrText xml:space="preserve"> PAGEREF _Toc309 \h </w:instrText>
+            <w:instrText xml:space="preserve"> PAGEREF _Toc463 \h </w:instrText>
           </w:r>
           <w:r>
             <w:fldChar w:fldCharType="separate"/>
@@ -3086,7 +3086,7 @@
             <w:fldChar w:fldCharType="begin"/>
           </w:r>
           <w:r>
-            <w:instrText xml:space="preserve"> HYPERLINK \l _Toc9133 </w:instrText>
+            <w:instrText xml:space="preserve"> HYPERLINK \l _Toc2543 </w:instrText>
           </w:r>
           <w:r>
             <w:fldChar w:fldCharType="separate"/>
@@ -3101,7 +3101,7 @@
             <w:fldChar w:fldCharType="begin"/>
           </w:r>
           <w:r>
-            <w:instrText xml:space="preserve"> PAGEREF _Toc9133 \h </w:instrText>
+            <w:instrText xml:space="preserve"> PAGEREF _Toc2543 \h </w:instrText>
           </w:r>
           <w:r>
             <w:fldChar w:fldCharType="separate"/>
@@ -3127,7 +3127,7 @@
             <w:fldChar w:fldCharType="begin"/>
           </w:r>
           <w:r>
-            <w:instrText xml:space="preserve"> HYPERLINK \l _Toc24050 </w:instrText>
+            <w:instrText xml:space="preserve"> HYPERLINK \l _Toc1061 </w:instrText>
           </w:r>
           <w:r>
             <w:fldChar w:fldCharType="separate"/>
@@ -3142,7 +3142,7 @@
             <w:fldChar w:fldCharType="begin"/>
           </w:r>
           <w:r>
-            <w:instrText xml:space="preserve"> PAGEREF _Toc24050 \h </w:instrText>
+            <w:instrText xml:space="preserve"> PAGEREF _Toc1061 \h </w:instrText>
           </w:r>
           <w:r>
             <w:fldChar w:fldCharType="separate"/>
@@ -3168,7 +3168,7 @@
             <w:fldChar w:fldCharType="begin"/>
           </w:r>
           <w:r>
-            <w:instrText xml:space="preserve"> HYPERLINK \l _Toc29960 </w:instrText>
+            <w:instrText xml:space="preserve"> HYPERLINK \l _Toc1014 </w:instrText>
           </w:r>
           <w:r>
             <w:fldChar w:fldCharType="separate"/>
@@ -3183,7 +3183,7 @@
             <w:fldChar w:fldCharType="begin"/>
           </w:r>
           <w:r>
-            <w:instrText xml:space="preserve"> PAGEREF _Toc29960 \h </w:instrText>
+            <w:instrText xml:space="preserve"> PAGEREF _Toc1014 \h </w:instrText>
           </w:r>
           <w:r>
             <w:fldChar w:fldCharType="separate"/>
@@ -3209,7 +3209,7 @@
             <w:fldChar w:fldCharType="begin"/>
           </w:r>
           <w:r>
-            <w:instrText xml:space="preserve"> HYPERLINK \l _Toc7492 </w:instrText>
+            <w:instrText xml:space="preserve"> HYPERLINK \l _Toc1685 </w:instrText>
           </w:r>
           <w:r>
             <w:fldChar w:fldCharType="separate"/>
@@ -3224,7 +3224,7 @@
             <w:fldChar w:fldCharType="begin"/>
           </w:r>
           <w:r>
-            <w:instrText xml:space="preserve"> PAGEREF _Toc7492 \h </w:instrText>
+            <w:instrText xml:space="preserve"> PAGEREF _Toc1685 \h </w:instrText>
           </w:r>
           <w:r>
             <w:fldChar w:fldCharType="separate"/>
@@ -3250,7 +3250,7 @@
             <w:fldChar w:fldCharType="begin"/>
           </w:r>
           <w:r>
-            <w:instrText xml:space="preserve"> HYPERLINK \l _Toc24200 </w:instrText>
+            <w:instrText xml:space="preserve"> HYPERLINK \l _Toc20530 </w:instrText>
           </w:r>
           <w:r>
             <w:fldChar w:fldCharType="separate"/>
@@ -3265,7 +3265,7 @@
             <w:fldChar w:fldCharType="begin"/>
           </w:r>
           <w:r>
-            <w:instrText xml:space="preserve"> PAGEREF _Toc24200 \h </w:instrText>
+            <w:instrText xml:space="preserve"> PAGEREF _Toc20530 \h </w:instrText>
           </w:r>
           <w:r>
             <w:fldChar w:fldCharType="separate"/>
@@ -3291,7 +3291,7 @@
             <w:fldChar w:fldCharType="begin"/>
           </w:r>
           <w:r>
-            <w:instrText xml:space="preserve"> HYPERLINK \l _Toc9607 </w:instrText>
+            <w:instrText xml:space="preserve"> HYPERLINK \l _Toc14302 </w:instrText>
           </w:r>
           <w:r>
             <w:fldChar w:fldCharType="separate"/>
@@ -3306,7 +3306,7 @@
             <w:fldChar w:fldCharType="begin"/>
           </w:r>
           <w:r>
-            <w:instrText xml:space="preserve"> PAGEREF _Toc9607 \h </w:instrText>
+            <w:instrText xml:space="preserve"> PAGEREF _Toc14302 \h </w:instrText>
           </w:r>
           <w:r>
             <w:fldChar w:fldCharType="separate"/>
@@ -3332,7 +3332,7 @@
             <w:fldChar w:fldCharType="begin"/>
           </w:r>
           <w:r>
-            <w:instrText xml:space="preserve"> HYPERLINK \l _Toc17939 </w:instrText>
+            <w:instrText xml:space="preserve"> HYPERLINK \l _Toc18560 </w:instrText>
           </w:r>
           <w:r>
             <w:fldChar w:fldCharType="separate"/>
@@ -3347,7 +3347,7 @@
             <w:fldChar w:fldCharType="begin"/>
           </w:r>
           <w:r>
-            <w:instrText xml:space="preserve"> PAGEREF _Toc17939 \h </w:instrText>
+            <w:instrText xml:space="preserve"> PAGEREF _Toc18560 \h </w:instrText>
           </w:r>
           <w:r>
             <w:fldChar w:fldCharType="separate"/>
@@ -3373,7 +3373,7 @@
             <w:fldChar w:fldCharType="begin"/>
           </w:r>
           <w:r>
-            <w:instrText xml:space="preserve"> HYPERLINK \l _Toc515 </w:instrText>
+            <w:instrText xml:space="preserve"> HYPERLINK \l _Toc16408 </w:instrText>
           </w:r>
           <w:r>
             <w:fldChar w:fldCharType="separate"/>
@@ -3388,7 +3388,7 @@
             <w:fldChar w:fldCharType="begin"/>
           </w:r>
           <w:r>
-            <w:instrText xml:space="preserve"> PAGEREF _Toc515 \h </w:instrText>
+            <w:instrText xml:space="preserve"> PAGEREF _Toc16408 \h </w:instrText>
           </w:r>
           <w:r>
             <w:fldChar w:fldCharType="separate"/>
@@ -3414,7 +3414,7 @@
             <w:fldChar w:fldCharType="begin"/>
           </w:r>
           <w:r>
-            <w:instrText xml:space="preserve"> HYPERLINK \l _Toc15084 </w:instrText>
+            <w:instrText xml:space="preserve"> HYPERLINK \l _Toc7041 </w:instrText>
           </w:r>
           <w:r>
             <w:fldChar w:fldCharType="separate"/>
@@ -3429,7 +3429,7 @@
             <w:fldChar w:fldCharType="begin"/>
           </w:r>
           <w:r>
-            <w:instrText xml:space="preserve"> PAGEREF _Toc15084 \h </w:instrText>
+            <w:instrText xml:space="preserve"> PAGEREF _Toc7041 \h </w:instrText>
           </w:r>
           <w:r>
             <w:fldChar w:fldCharType="separate"/>
@@ -3455,7 +3455,7 @@
             <w:fldChar w:fldCharType="begin"/>
           </w:r>
           <w:r>
-            <w:instrText xml:space="preserve"> HYPERLINK \l _Toc14775 </w:instrText>
+            <w:instrText xml:space="preserve"> HYPERLINK \l _Toc18087 </w:instrText>
           </w:r>
           <w:r>
             <w:fldChar w:fldCharType="separate"/>
@@ -3470,7 +3470,7 @@
             <w:fldChar w:fldCharType="begin"/>
           </w:r>
           <w:r>
-            <w:instrText xml:space="preserve"> PAGEREF _Toc14775 \h </w:instrText>
+            <w:instrText xml:space="preserve"> PAGEREF _Toc18087 \h </w:instrText>
           </w:r>
           <w:r>
             <w:fldChar w:fldCharType="separate"/>
@@ -3496,7 +3496,7 @@
             <w:fldChar w:fldCharType="begin"/>
           </w:r>
           <w:r>
-            <w:instrText xml:space="preserve"> HYPERLINK \l _Toc12719 </w:instrText>
+            <w:instrText xml:space="preserve"> HYPERLINK \l _Toc16710 </w:instrText>
           </w:r>
           <w:r>
             <w:fldChar w:fldCharType="separate"/>
@@ -3511,7 +3511,7 @@
             <w:fldChar w:fldCharType="begin"/>
           </w:r>
           <w:r>
-            <w:instrText xml:space="preserve"> PAGEREF _Toc12719 \h </w:instrText>
+            <w:instrText xml:space="preserve"> PAGEREF _Toc16710 \h </w:instrText>
           </w:r>
           <w:r>
             <w:fldChar w:fldCharType="separate"/>
@@ -3537,7 +3537,7 @@
             <w:fldChar w:fldCharType="begin"/>
           </w:r>
           <w:r>
-            <w:instrText xml:space="preserve"> HYPERLINK \l _Toc23020 </w:instrText>
+            <w:instrText xml:space="preserve"> HYPERLINK \l _Toc162 </w:instrText>
           </w:r>
           <w:r>
             <w:fldChar w:fldCharType="separate"/>
@@ -3552,7 +3552,7 @@
             <w:fldChar w:fldCharType="begin"/>
           </w:r>
           <w:r>
-            <w:instrText xml:space="preserve"> PAGEREF _Toc23020 \h </w:instrText>
+            <w:instrText xml:space="preserve"> PAGEREF _Toc162 \h </w:instrText>
           </w:r>
           <w:r>
             <w:fldChar w:fldCharType="separate"/>
@@ -3578,7 +3578,7 @@
             <w:fldChar w:fldCharType="begin"/>
           </w:r>
           <w:r>
-            <w:instrText xml:space="preserve"> HYPERLINK \l _Toc10556 </w:instrText>
+            <w:instrText xml:space="preserve"> HYPERLINK \l _Toc2706 </w:instrText>
           </w:r>
           <w:r>
             <w:fldChar w:fldCharType="separate"/>
@@ -3593,7 +3593,7 @@
             <w:fldChar w:fldCharType="begin"/>
           </w:r>
           <w:r>
-            <w:instrText xml:space="preserve"> PAGEREF _Toc10556 \h </w:instrText>
+            <w:instrText xml:space="preserve"> PAGEREF _Toc2706 \h </w:instrText>
           </w:r>
           <w:r>
             <w:fldChar w:fldCharType="separate"/>
@@ -3619,7 +3619,7 @@
             <w:fldChar w:fldCharType="begin"/>
           </w:r>
           <w:r>
-            <w:instrText xml:space="preserve"> HYPERLINK \l _Toc14825 </w:instrText>
+            <w:instrText xml:space="preserve"> HYPERLINK \l _Toc21418 </w:instrText>
           </w:r>
           <w:r>
             <w:fldChar w:fldCharType="separate"/>
@@ -3634,7 +3634,7 @@
             <w:fldChar w:fldCharType="begin"/>
           </w:r>
           <w:r>
-            <w:instrText xml:space="preserve"> PAGEREF _Toc14825 \h </w:instrText>
+            <w:instrText xml:space="preserve"> PAGEREF _Toc21418 \h </w:instrText>
           </w:r>
           <w:r>
             <w:fldChar w:fldCharType="separate"/>
@@ -3660,7 +3660,7 @@
             <w:fldChar w:fldCharType="begin"/>
           </w:r>
           <w:r>
-            <w:instrText xml:space="preserve"> HYPERLINK \l _Toc18422 </w:instrText>
+            <w:instrText xml:space="preserve"> HYPERLINK \l _Toc18140 </w:instrText>
           </w:r>
           <w:r>
             <w:fldChar w:fldCharType="separate"/>
@@ -3675,7 +3675,7 @@
             <w:fldChar w:fldCharType="begin"/>
           </w:r>
           <w:r>
-            <w:instrText xml:space="preserve"> PAGEREF _Toc18422 \h </w:instrText>
+            <w:instrText xml:space="preserve"> PAGEREF _Toc18140 \h </w:instrText>
           </w:r>
           <w:r>
             <w:fldChar w:fldCharType="separate"/>
@@ -3701,7 +3701,7 @@
             <w:fldChar w:fldCharType="begin"/>
           </w:r>
           <w:r>
-            <w:instrText xml:space="preserve"> HYPERLINK \l _Toc27072 </w:instrText>
+            <w:instrText xml:space="preserve"> HYPERLINK \l _Toc14405 </w:instrText>
           </w:r>
           <w:r>
             <w:fldChar w:fldCharType="separate"/>
@@ -3716,7 +3716,7 @@
             <w:fldChar w:fldCharType="begin"/>
           </w:r>
           <w:r>
-            <w:instrText xml:space="preserve"> PAGEREF _Toc27072 \h </w:instrText>
+            <w:instrText xml:space="preserve"> PAGEREF _Toc14405 \h </w:instrText>
           </w:r>
           <w:r>
             <w:fldChar w:fldCharType="separate"/>
@@ -3742,7 +3742,7 @@
             <w:fldChar w:fldCharType="begin"/>
           </w:r>
           <w:r>
-            <w:instrText xml:space="preserve"> HYPERLINK \l _Toc15361 </w:instrText>
+            <w:instrText xml:space="preserve"> HYPERLINK \l _Toc8123 </w:instrText>
           </w:r>
           <w:r>
             <w:fldChar w:fldCharType="separate"/>
@@ -3757,7 +3757,7 @@
             <w:fldChar w:fldCharType="begin"/>
           </w:r>
           <w:r>
-            <w:instrText xml:space="preserve"> PAGEREF _Toc15361 \h </w:instrText>
+            <w:instrText xml:space="preserve"> PAGEREF _Toc8123 \h </w:instrText>
           </w:r>
           <w:r>
             <w:fldChar w:fldCharType="separate"/>
@@ -3783,7 +3783,7 @@
             <w:fldChar w:fldCharType="begin"/>
           </w:r>
           <w:r>
-            <w:instrText xml:space="preserve"> HYPERLINK \l _Toc3087 </w:instrText>
+            <w:instrText xml:space="preserve"> HYPERLINK \l _Toc8245 </w:instrText>
           </w:r>
           <w:r>
             <w:fldChar w:fldCharType="separate"/>
@@ -3798,7 +3798,7 @@
             <w:fldChar w:fldCharType="begin"/>
           </w:r>
           <w:r>
-            <w:instrText xml:space="preserve"> PAGEREF _Toc3087 \h </w:instrText>
+            <w:instrText xml:space="preserve"> PAGEREF _Toc8245 \h </w:instrText>
           </w:r>
           <w:r>
             <w:fldChar w:fldCharType="separate"/>
@@ -3824,7 +3824,7 @@
             <w:fldChar w:fldCharType="begin"/>
           </w:r>
           <w:r>
-            <w:instrText xml:space="preserve"> HYPERLINK \l _Toc15971 </w:instrText>
+            <w:instrText xml:space="preserve"> HYPERLINK \l _Toc31846 </w:instrText>
           </w:r>
           <w:r>
             <w:fldChar w:fldCharType="separate"/>
@@ -3839,7 +3839,7 @@
             <w:fldChar w:fldCharType="begin"/>
           </w:r>
           <w:r>
-            <w:instrText xml:space="preserve"> PAGEREF _Toc15971 \h </w:instrText>
+            <w:instrText xml:space="preserve"> PAGEREF _Toc31846 \h </w:instrText>
           </w:r>
           <w:r>
             <w:fldChar w:fldCharType="separate"/>
@@ -3865,7 +3865,7 @@
             <w:fldChar w:fldCharType="begin"/>
           </w:r>
           <w:r>
-            <w:instrText xml:space="preserve"> HYPERLINK \l _Toc6943 </w:instrText>
+            <w:instrText xml:space="preserve"> HYPERLINK \l _Toc2149 </w:instrText>
           </w:r>
           <w:r>
             <w:fldChar w:fldCharType="separate"/>
@@ -3880,7 +3880,7 @@
             <w:fldChar w:fldCharType="begin"/>
           </w:r>
           <w:r>
-            <w:instrText xml:space="preserve"> PAGEREF _Toc6943 \h </w:instrText>
+            <w:instrText xml:space="preserve"> PAGEREF _Toc2149 \h </w:instrText>
           </w:r>
           <w:r>
             <w:fldChar w:fldCharType="separate"/>
@@ -3906,7 +3906,7 @@
             <w:fldChar w:fldCharType="begin"/>
           </w:r>
           <w:r>
-            <w:instrText xml:space="preserve"> HYPERLINK \l _Toc22578 </w:instrText>
+            <w:instrText xml:space="preserve"> HYPERLINK \l _Toc5732 </w:instrText>
           </w:r>
           <w:r>
             <w:fldChar w:fldCharType="separate"/>
@@ -3921,7 +3921,7 @@
             <w:fldChar w:fldCharType="begin"/>
           </w:r>
           <w:r>
-            <w:instrText xml:space="preserve"> PAGEREF _Toc22578 \h </w:instrText>
+            <w:instrText xml:space="preserve"> PAGEREF _Toc5732 \h </w:instrText>
           </w:r>
           <w:r>
             <w:fldChar w:fldCharType="separate"/>
@@ -3947,7 +3947,7 @@
             <w:fldChar w:fldCharType="begin"/>
           </w:r>
           <w:r>
-            <w:instrText xml:space="preserve"> HYPERLINK \l _Toc23512 </w:instrText>
+            <w:instrText xml:space="preserve"> HYPERLINK \l _Toc23392 </w:instrText>
           </w:r>
           <w:r>
             <w:fldChar w:fldCharType="separate"/>
@@ -3962,7 +3962,7 @@
             <w:fldChar w:fldCharType="begin"/>
           </w:r>
           <w:r>
-            <w:instrText xml:space="preserve"> PAGEREF _Toc23512 \h </w:instrText>
+            <w:instrText xml:space="preserve"> PAGEREF _Toc23392 \h </w:instrText>
           </w:r>
           <w:r>
             <w:fldChar w:fldCharType="separate"/>
@@ -3988,7 +3988,7 @@
             <w:fldChar w:fldCharType="begin"/>
           </w:r>
           <w:r>
-            <w:instrText xml:space="preserve"> HYPERLINK \l _Toc16951 </w:instrText>
+            <w:instrText xml:space="preserve"> HYPERLINK \l _Toc28845 </w:instrText>
           </w:r>
           <w:r>
             <w:fldChar w:fldCharType="separate"/>
@@ -4003,7 +4003,7 @@
             <w:fldChar w:fldCharType="begin"/>
           </w:r>
           <w:r>
-            <w:instrText xml:space="preserve"> PAGEREF _Toc16951 \h </w:instrText>
+            <w:instrText xml:space="preserve"> PAGEREF _Toc28845 \h </w:instrText>
           </w:r>
           <w:r>
             <w:fldChar w:fldCharType="separate"/>
@@ -4029,7 +4029,7 @@
             <w:fldChar w:fldCharType="begin"/>
           </w:r>
           <w:r>
-            <w:instrText xml:space="preserve"> HYPERLINK \l _Toc5462 </w:instrText>
+            <w:instrText xml:space="preserve"> HYPERLINK \l _Toc12407 </w:instrText>
           </w:r>
           <w:r>
             <w:fldChar w:fldCharType="separate"/>
@@ -4044,7 +4044,7 @@
             <w:fldChar w:fldCharType="begin"/>
           </w:r>
           <w:r>
-            <w:instrText xml:space="preserve"> PAGEREF _Toc5462 \h </w:instrText>
+            <w:instrText xml:space="preserve"> PAGEREF _Toc12407 \h </w:instrText>
           </w:r>
           <w:r>
             <w:fldChar w:fldCharType="separate"/>
@@ -4070,7 +4070,7 @@
             <w:fldChar w:fldCharType="begin"/>
           </w:r>
           <w:r>
-            <w:instrText xml:space="preserve"> HYPERLINK \l _Toc15027 </w:instrText>
+            <w:instrText xml:space="preserve"> HYPERLINK \l _Toc11453 </w:instrText>
           </w:r>
           <w:r>
             <w:fldChar w:fldCharType="separate"/>
@@ -4085,7 +4085,7 @@
             <w:fldChar w:fldCharType="begin"/>
           </w:r>
           <w:r>
-            <w:instrText xml:space="preserve"> PAGEREF _Toc15027 \h </w:instrText>
+            <w:instrText xml:space="preserve"> PAGEREF _Toc11453 \h </w:instrText>
           </w:r>
           <w:r>
             <w:fldChar w:fldCharType="separate"/>
@@ -4111,7 +4111,7 @@
             <w:fldChar w:fldCharType="begin"/>
           </w:r>
           <w:r>
-            <w:instrText xml:space="preserve"> HYPERLINK \l _Toc18972 </w:instrText>
+            <w:instrText xml:space="preserve"> HYPERLINK \l _Toc5361 </w:instrText>
           </w:r>
           <w:r>
             <w:fldChar w:fldCharType="separate"/>
@@ -4126,7 +4126,7 @@
             <w:fldChar w:fldCharType="begin"/>
           </w:r>
           <w:r>
-            <w:instrText xml:space="preserve"> PAGEREF _Toc18972 \h </w:instrText>
+            <w:instrText xml:space="preserve"> PAGEREF _Toc5361 \h </w:instrText>
           </w:r>
           <w:r>
             <w:fldChar w:fldCharType="separate"/>
@@ -4152,7 +4152,7 @@
             <w:fldChar w:fldCharType="begin"/>
           </w:r>
           <w:r>
-            <w:instrText xml:space="preserve"> HYPERLINK \l _Toc22648 </w:instrText>
+            <w:instrText xml:space="preserve"> HYPERLINK \l _Toc21874 </w:instrText>
           </w:r>
           <w:r>
             <w:fldChar w:fldCharType="separate"/>
@@ -4167,7 +4167,7 @@
             <w:fldChar w:fldCharType="begin"/>
           </w:r>
           <w:r>
-            <w:instrText xml:space="preserve"> PAGEREF _Toc22648 \h </w:instrText>
+            <w:instrText xml:space="preserve"> PAGEREF _Toc21874 \h </w:instrText>
           </w:r>
           <w:r>
             <w:fldChar w:fldCharType="separate"/>
@@ -4193,7 +4193,7 @@
             <w:fldChar w:fldCharType="begin"/>
           </w:r>
           <w:r>
-            <w:instrText xml:space="preserve"> HYPERLINK \l _Toc30491 </w:instrText>
+            <w:instrText xml:space="preserve"> HYPERLINK \l _Toc14343 </w:instrText>
           </w:r>
           <w:r>
             <w:fldChar w:fldCharType="separate"/>
@@ -4208,7 +4208,7 @@
             <w:fldChar w:fldCharType="begin"/>
           </w:r>
           <w:r>
-            <w:instrText xml:space="preserve"> PAGEREF _Toc30491 \h </w:instrText>
+            <w:instrText xml:space="preserve"> PAGEREF _Toc14343 \h </w:instrText>
           </w:r>
           <w:r>
             <w:fldChar w:fldCharType="separate"/>
@@ -4234,7 +4234,7 @@
             <w:fldChar w:fldCharType="begin"/>
           </w:r>
           <w:r>
-            <w:instrText xml:space="preserve"> HYPERLINK \l _Toc4290 </w:instrText>
+            <w:instrText xml:space="preserve"> HYPERLINK \l _Toc13740 </w:instrText>
           </w:r>
           <w:r>
             <w:fldChar w:fldCharType="separate"/>
@@ -4249,7 +4249,7 @@
             <w:fldChar w:fldCharType="begin"/>
           </w:r>
           <w:r>
-            <w:instrText xml:space="preserve"> PAGEREF _Toc4290 \h </w:instrText>
+            <w:instrText xml:space="preserve"> PAGEREF _Toc13740 \h </w:instrText>
           </w:r>
           <w:r>
             <w:fldChar w:fldCharType="separate"/>
@@ -4275,7 +4275,7 @@
             <w:fldChar w:fldCharType="begin"/>
           </w:r>
           <w:r>
-            <w:instrText xml:space="preserve"> HYPERLINK \l _Toc11017 </w:instrText>
+            <w:instrText xml:space="preserve"> HYPERLINK \l _Toc22396 </w:instrText>
           </w:r>
           <w:r>
             <w:fldChar w:fldCharType="separate"/>
@@ -4290,7 +4290,7 @@
             <w:fldChar w:fldCharType="begin"/>
           </w:r>
           <w:r>
-            <w:instrText xml:space="preserve"> PAGEREF _Toc11017 \h </w:instrText>
+            <w:instrText xml:space="preserve"> PAGEREF _Toc22396 \h </w:instrText>
           </w:r>
           <w:r>
             <w:fldChar w:fldCharType="separate"/>
@@ -4316,7 +4316,7 @@
             <w:fldChar w:fldCharType="begin"/>
           </w:r>
           <w:r>
-            <w:instrText xml:space="preserve"> HYPERLINK \l _Toc3760 </w:instrText>
+            <w:instrText xml:space="preserve"> HYPERLINK \l _Toc16642 </w:instrText>
           </w:r>
           <w:r>
             <w:fldChar w:fldCharType="separate"/>
@@ -4331,7 +4331,7 @@
             <w:fldChar w:fldCharType="begin"/>
           </w:r>
           <w:r>
-            <w:instrText xml:space="preserve"> PAGEREF _Toc3760 \h </w:instrText>
+            <w:instrText xml:space="preserve"> PAGEREF _Toc16642 \h </w:instrText>
           </w:r>
           <w:r>
             <w:fldChar w:fldCharType="separate"/>
@@ -4357,7 +4357,7 @@
             <w:fldChar w:fldCharType="begin"/>
           </w:r>
           <w:r>
-            <w:instrText xml:space="preserve"> HYPERLINK \l _Toc21434 </w:instrText>
+            <w:instrText xml:space="preserve"> HYPERLINK \l _Toc31232 </w:instrText>
           </w:r>
           <w:r>
             <w:fldChar w:fldCharType="separate"/>
@@ -4372,7 +4372,7 @@
             <w:fldChar w:fldCharType="begin"/>
           </w:r>
           <w:r>
-            <w:instrText xml:space="preserve"> PAGEREF _Toc21434 \h </w:instrText>
+            <w:instrText xml:space="preserve"> PAGEREF _Toc31232 \h </w:instrText>
           </w:r>
           <w:r>
             <w:fldChar w:fldCharType="separate"/>
@@ -4398,7 +4398,7 @@
             <w:fldChar w:fldCharType="begin"/>
           </w:r>
           <w:r>
-            <w:instrText xml:space="preserve"> HYPERLINK \l _Toc24143 </w:instrText>
+            <w:instrText xml:space="preserve"> HYPERLINK \l _Toc1802 </w:instrText>
           </w:r>
           <w:r>
             <w:fldChar w:fldCharType="separate"/>
@@ -4413,7 +4413,7 @@
             <w:fldChar w:fldCharType="begin"/>
           </w:r>
           <w:r>
-            <w:instrText xml:space="preserve"> PAGEREF _Toc24143 \h </w:instrText>
+            <w:instrText xml:space="preserve"> PAGEREF _Toc1802 \h </w:instrText>
           </w:r>
           <w:r>
             <w:fldChar w:fldCharType="separate"/>
@@ -4439,7 +4439,7 @@
             <w:fldChar w:fldCharType="begin"/>
           </w:r>
           <w:r>
-            <w:instrText xml:space="preserve"> HYPERLINK \l _Toc29797 </w:instrText>
+            <w:instrText xml:space="preserve"> HYPERLINK \l _Toc11727 </w:instrText>
           </w:r>
           <w:r>
             <w:fldChar w:fldCharType="separate"/>
@@ -4454,7 +4454,7 @@
             <w:fldChar w:fldCharType="begin"/>
           </w:r>
           <w:r>
-            <w:instrText xml:space="preserve"> PAGEREF _Toc29797 \h </w:instrText>
+            <w:instrText xml:space="preserve"> PAGEREF _Toc11727 \h </w:instrText>
           </w:r>
           <w:r>
             <w:fldChar w:fldCharType="separate"/>
@@ -4480,7 +4480,7 @@
             <w:fldChar w:fldCharType="begin"/>
           </w:r>
           <w:r>
-            <w:instrText xml:space="preserve"> HYPERLINK \l _Toc2005 </w:instrText>
+            <w:instrText xml:space="preserve"> HYPERLINK \l _Toc11786 </w:instrText>
           </w:r>
           <w:r>
             <w:fldChar w:fldCharType="separate"/>
@@ -4495,7 +4495,7 @@
             <w:fldChar w:fldCharType="begin"/>
           </w:r>
           <w:r>
-            <w:instrText xml:space="preserve"> PAGEREF _Toc2005 \h </w:instrText>
+            <w:instrText xml:space="preserve"> PAGEREF _Toc11786 \h </w:instrText>
           </w:r>
           <w:r>
             <w:fldChar w:fldCharType="separate"/>
@@ -4521,7 +4521,7 @@
             <w:fldChar w:fldCharType="begin"/>
           </w:r>
           <w:r>
-            <w:instrText xml:space="preserve"> HYPERLINK \l _Toc9947 </w:instrText>
+            <w:instrText xml:space="preserve"> HYPERLINK \l _Toc29992 </w:instrText>
           </w:r>
           <w:r>
             <w:fldChar w:fldCharType="separate"/>
@@ -4536,7 +4536,7 @@
             <w:fldChar w:fldCharType="begin"/>
           </w:r>
           <w:r>
-            <w:instrText xml:space="preserve"> PAGEREF _Toc9947 \h </w:instrText>
+            <w:instrText xml:space="preserve"> PAGEREF _Toc29992 \h </w:instrText>
           </w:r>
           <w:r>
             <w:fldChar w:fldCharType="separate"/>
@@ -4568,7 +4568,7 @@
       <w:pPr>
         <w:pStyle w:val="2"/>
       </w:pPr>
-      <w:bookmarkStart w:id="4" w:name="_Toc11502"/>
+      <w:bookmarkStart w:id="4" w:name="_Toc26429"/>
       <w:r>
         <w:t>List of Tables</w:t>
       </w:r>
@@ -4614,7 +4614,7 @@
             <w:fldChar w:fldCharType="begin"/>
           </w:r>
           <w:r>
-            <w:instrText xml:space="preserve"> HYPERLINK \l _Toc22383 </w:instrText>
+            <w:instrText xml:space="preserve"> HYPERLINK \l _Toc6029 </w:instrText>
           </w:r>
           <w:r>
             <w:fldChar w:fldCharType="separate"/>
@@ -4629,7 +4629,7 @@
             <w:fldChar w:fldCharType="begin"/>
           </w:r>
           <w:r>
-            <w:instrText xml:space="preserve"> PAGEREF _Toc22383 \h </w:instrText>
+            <w:instrText xml:space="preserve"> PAGEREF _Toc6029 \h </w:instrText>
           </w:r>
           <w:r>
             <w:fldChar w:fldCharType="separate"/>
@@ -4655,7 +4655,7 @@
             <w:fldChar w:fldCharType="begin"/>
           </w:r>
           <w:r>
-            <w:instrText xml:space="preserve"> HYPERLINK \l _Toc6470 </w:instrText>
+            <w:instrText xml:space="preserve"> HYPERLINK \l _Toc1514 </w:instrText>
           </w:r>
           <w:r>
             <w:fldChar w:fldCharType="separate"/>
@@ -4670,7 +4670,7 @@
             <w:fldChar w:fldCharType="begin"/>
           </w:r>
           <w:r>
-            <w:instrText xml:space="preserve"> PAGEREF _Toc6470 \h </w:instrText>
+            <w:instrText xml:space="preserve"> PAGEREF _Toc1514 \h </w:instrText>
           </w:r>
           <w:r>
             <w:fldChar w:fldCharType="separate"/>
@@ -4696,7 +4696,7 @@
             <w:fldChar w:fldCharType="begin"/>
           </w:r>
           <w:r>
-            <w:instrText xml:space="preserve"> HYPERLINK \l _Toc7645 </w:instrText>
+            <w:instrText xml:space="preserve"> HYPERLINK \l _Toc12568 </w:instrText>
           </w:r>
           <w:r>
             <w:fldChar w:fldCharType="separate"/>
@@ -4711,7 +4711,7 @@
             <w:fldChar w:fldCharType="begin"/>
           </w:r>
           <w:r>
-            <w:instrText xml:space="preserve"> PAGEREF _Toc7645 \h </w:instrText>
+            <w:instrText xml:space="preserve"> PAGEREF _Toc12568 \h </w:instrText>
           </w:r>
           <w:r>
             <w:fldChar w:fldCharType="separate"/>
@@ -4737,7 +4737,7 @@
             <w:fldChar w:fldCharType="begin"/>
           </w:r>
           <w:r>
-            <w:instrText xml:space="preserve"> HYPERLINK \l _Toc29193 </w:instrText>
+            <w:instrText xml:space="preserve"> HYPERLINK \l _Toc27992 </w:instrText>
           </w:r>
           <w:r>
             <w:fldChar w:fldCharType="separate"/>
@@ -4752,7 +4752,7 @@
             <w:fldChar w:fldCharType="begin"/>
           </w:r>
           <w:r>
-            <w:instrText xml:space="preserve"> PAGEREF _Toc29193 \h </w:instrText>
+            <w:instrText xml:space="preserve"> PAGEREF _Toc27992 \h </w:instrText>
           </w:r>
           <w:r>
             <w:fldChar w:fldCharType="separate"/>
@@ -4778,7 +4778,7 @@
             <w:fldChar w:fldCharType="begin"/>
           </w:r>
           <w:r>
-            <w:instrText xml:space="preserve"> HYPERLINK \l _Toc29635 </w:instrText>
+            <w:instrText xml:space="preserve"> HYPERLINK \l _Toc4788 </w:instrText>
           </w:r>
           <w:r>
             <w:fldChar w:fldCharType="separate"/>
@@ -4793,7 +4793,7 @@
             <w:fldChar w:fldCharType="begin"/>
           </w:r>
           <w:r>
-            <w:instrText xml:space="preserve"> PAGEREF _Toc29635 \h </w:instrText>
+            <w:instrText xml:space="preserve"> PAGEREF _Toc4788 \h </w:instrText>
           </w:r>
           <w:r>
             <w:fldChar w:fldCharType="separate"/>
@@ -4819,7 +4819,7 @@
             <w:fldChar w:fldCharType="begin"/>
           </w:r>
           <w:r>
-            <w:instrText xml:space="preserve"> HYPERLINK \l _Toc20344 </w:instrText>
+            <w:instrText xml:space="preserve"> HYPERLINK \l _Toc18800 </w:instrText>
           </w:r>
           <w:r>
             <w:fldChar w:fldCharType="separate"/>
@@ -4834,7 +4834,7 @@
             <w:fldChar w:fldCharType="begin"/>
           </w:r>
           <w:r>
-            <w:instrText xml:space="preserve"> PAGEREF _Toc20344 \h </w:instrText>
+            <w:instrText xml:space="preserve"> PAGEREF _Toc18800 \h </w:instrText>
           </w:r>
           <w:r>
             <w:fldChar w:fldCharType="separate"/>
@@ -4860,7 +4860,7 @@
             <w:fldChar w:fldCharType="begin"/>
           </w:r>
           <w:r>
-            <w:instrText xml:space="preserve"> HYPERLINK \l _Toc2231 </w:instrText>
+            <w:instrText xml:space="preserve"> HYPERLINK \l _Toc10986 </w:instrText>
           </w:r>
           <w:r>
             <w:fldChar w:fldCharType="separate"/>
@@ -4875,7 +4875,7 @@
             <w:fldChar w:fldCharType="begin"/>
           </w:r>
           <w:r>
-            <w:instrText xml:space="preserve"> PAGEREF _Toc2231 \h </w:instrText>
+            <w:instrText xml:space="preserve"> PAGEREF _Toc10986 \h </w:instrText>
           </w:r>
           <w:r>
             <w:fldChar w:fldCharType="separate"/>
@@ -4901,7 +4901,7 @@
             <w:fldChar w:fldCharType="begin"/>
           </w:r>
           <w:r>
-            <w:instrText xml:space="preserve"> HYPERLINK \l _Toc29043 </w:instrText>
+            <w:instrText xml:space="preserve"> HYPERLINK \l _Toc25246 </w:instrText>
           </w:r>
           <w:r>
             <w:fldChar w:fldCharType="separate"/>
@@ -4916,7 +4916,7 @@
             <w:fldChar w:fldCharType="begin"/>
           </w:r>
           <w:r>
-            <w:instrText xml:space="preserve"> PAGEREF _Toc29043 \h </w:instrText>
+            <w:instrText xml:space="preserve"> PAGEREF _Toc25246 \h </w:instrText>
           </w:r>
           <w:r>
             <w:fldChar w:fldCharType="separate"/>
@@ -4942,7 +4942,7 @@
             <w:fldChar w:fldCharType="begin"/>
           </w:r>
           <w:r>
-            <w:instrText xml:space="preserve"> HYPERLINK \l _Toc19507 </w:instrText>
+            <w:instrText xml:space="preserve"> HYPERLINK \l _Toc6187 </w:instrText>
           </w:r>
           <w:r>
             <w:fldChar w:fldCharType="separate"/>
@@ -4957,7 +4957,7 @@
             <w:fldChar w:fldCharType="begin"/>
           </w:r>
           <w:r>
-            <w:instrText xml:space="preserve"> PAGEREF _Toc19507 \h </w:instrText>
+            <w:instrText xml:space="preserve"> PAGEREF _Toc6187 \h </w:instrText>
           </w:r>
           <w:r>
             <w:fldChar w:fldCharType="separate"/>
@@ -4983,7 +4983,7 @@
             <w:fldChar w:fldCharType="begin"/>
           </w:r>
           <w:r>
-            <w:instrText xml:space="preserve"> HYPERLINK \l _Toc30951 </w:instrText>
+            <w:instrText xml:space="preserve"> HYPERLINK \l _Toc29315 </w:instrText>
           </w:r>
           <w:r>
             <w:fldChar w:fldCharType="separate"/>
@@ -4998,7 +4998,7 @@
             <w:fldChar w:fldCharType="begin"/>
           </w:r>
           <w:r>
-            <w:instrText xml:space="preserve"> PAGEREF _Toc30951 \h </w:instrText>
+            <w:instrText xml:space="preserve"> PAGEREF _Toc29315 \h </w:instrText>
           </w:r>
           <w:r>
             <w:fldChar w:fldCharType="separate"/>
@@ -5024,7 +5024,7 @@
             <w:fldChar w:fldCharType="begin"/>
           </w:r>
           <w:r>
-            <w:instrText xml:space="preserve"> HYPERLINK \l _Toc18747 </w:instrText>
+            <w:instrText xml:space="preserve"> HYPERLINK \l _Toc17846 </w:instrText>
           </w:r>
           <w:r>
             <w:fldChar w:fldCharType="separate"/>
@@ -5039,7 +5039,7 @@
             <w:fldChar w:fldCharType="begin"/>
           </w:r>
           <w:r>
-            <w:instrText xml:space="preserve"> PAGEREF _Toc18747 \h </w:instrText>
+            <w:instrText xml:space="preserve"> PAGEREF _Toc17846 \h </w:instrText>
           </w:r>
           <w:r>
             <w:fldChar w:fldCharType="separate"/>
@@ -5065,7 +5065,7 @@
             <w:fldChar w:fldCharType="begin"/>
           </w:r>
           <w:r>
-            <w:instrText xml:space="preserve"> HYPERLINK \l _Toc16535 </w:instrText>
+            <w:instrText xml:space="preserve"> HYPERLINK \l _Toc18421 </w:instrText>
           </w:r>
           <w:r>
             <w:fldChar w:fldCharType="separate"/>
@@ -5080,7 +5080,7 @@
             <w:fldChar w:fldCharType="begin"/>
           </w:r>
           <w:r>
-            <w:instrText xml:space="preserve"> PAGEREF _Toc16535 \h </w:instrText>
+            <w:instrText xml:space="preserve"> PAGEREF _Toc18421 \h </w:instrText>
           </w:r>
           <w:r>
             <w:fldChar w:fldCharType="separate"/>
@@ -5106,7 +5106,7 @@
             <w:fldChar w:fldCharType="begin"/>
           </w:r>
           <w:r>
-            <w:instrText xml:space="preserve"> HYPERLINK \l _Toc25919 </w:instrText>
+            <w:instrText xml:space="preserve"> HYPERLINK \l _Toc20412 </w:instrText>
           </w:r>
           <w:r>
             <w:fldChar w:fldCharType="separate"/>
@@ -5121,7 +5121,7 @@
             <w:fldChar w:fldCharType="begin"/>
           </w:r>
           <w:r>
-            <w:instrText xml:space="preserve"> PAGEREF _Toc25919 \h </w:instrText>
+            <w:instrText xml:space="preserve"> PAGEREF _Toc20412 \h </w:instrText>
           </w:r>
           <w:r>
             <w:fldChar w:fldCharType="separate"/>
@@ -5147,7 +5147,7 @@
             <w:fldChar w:fldCharType="begin"/>
           </w:r>
           <w:r>
-            <w:instrText xml:space="preserve"> HYPERLINK \l _Toc13085 </w:instrText>
+            <w:instrText xml:space="preserve"> HYPERLINK \l _Toc27719 </w:instrText>
           </w:r>
           <w:r>
             <w:fldChar w:fldCharType="separate"/>
@@ -5162,7 +5162,7 @@
             <w:fldChar w:fldCharType="begin"/>
           </w:r>
           <w:r>
-            <w:instrText xml:space="preserve"> PAGEREF _Toc13085 \h </w:instrText>
+            <w:instrText xml:space="preserve"> PAGEREF _Toc27719 \h </w:instrText>
           </w:r>
           <w:r>
             <w:fldChar w:fldCharType="separate"/>
@@ -5188,7 +5188,7 @@
             <w:fldChar w:fldCharType="begin"/>
           </w:r>
           <w:r>
-            <w:instrText xml:space="preserve"> HYPERLINK \l _Toc1602 </w:instrText>
+            <w:instrText xml:space="preserve"> HYPERLINK \l _Toc29377 </w:instrText>
           </w:r>
           <w:r>
             <w:fldChar w:fldCharType="separate"/>
@@ -5203,7 +5203,7 @@
             <w:fldChar w:fldCharType="begin"/>
           </w:r>
           <w:r>
-            <w:instrText xml:space="preserve"> PAGEREF _Toc1602 \h </w:instrText>
+            <w:instrText xml:space="preserve"> PAGEREF _Toc29377 \h </w:instrText>
           </w:r>
           <w:r>
             <w:fldChar w:fldCharType="separate"/>
@@ -5229,7 +5229,7 @@
             <w:fldChar w:fldCharType="begin"/>
           </w:r>
           <w:r>
-            <w:instrText xml:space="preserve"> HYPERLINK \l _Toc16939 </w:instrText>
+            <w:instrText xml:space="preserve"> HYPERLINK \l _Toc11722 </w:instrText>
           </w:r>
           <w:r>
             <w:fldChar w:fldCharType="separate"/>
@@ -5244,7 +5244,7 @@
             <w:fldChar w:fldCharType="begin"/>
           </w:r>
           <w:r>
-            <w:instrText xml:space="preserve"> PAGEREF _Toc16939 \h </w:instrText>
+            <w:instrText xml:space="preserve"> PAGEREF _Toc11722 \h </w:instrText>
           </w:r>
           <w:r>
             <w:fldChar w:fldCharType="separate"/>
@@ -5270,7 +5270,7 @@
             <w:fldChar w:fldCharType="begin"/>
           </w:r>
           <w:r>
-            <w:instrText xml:space="preserve"> HYPERLINK \l _Toc25660 </w:instrText>
+            <w:instrText xml:space="preserve"> HYPERLINK \l _Toc2629 </w:instrText>
           </w:r>
           <w:r>
             <w:fldChar w:fldCharType="separate"/>
@@ -5285,7 +5285,7 @@
             <w:fldChar w:fldCharType="begin"/>
           </w:r>
           <w:r>
-            <w:instrText xml:space="preserve"> PAGEREF _Toc25660 \h </w:instrText>
+            <w:instrText xml:space="preserve"> PAGEREF _Toc2629 \h </w:instrText>
           </w:r>
           <w:r>
             <w:fldChar w:fldCharType="separate"/>
@@ -5311,7 +5311,7 @@
             <w:fldChar w:fldCharType="begin"/>
           </w:r>
           <w:r>
-            <w:instrText xml:space="preserve"> HYPERLINK \l _Toc25367 </w:instrText>
+            <w:instrText xml:space="preserve"> HYPERLINK \l _Toc13203 </w:instrText>
           </w:r>
           <w:r>
             <w:fldChar w:fldCharType="separate"/>
@@ -5326,7 +5326,7 @@
             <w:fldChar w:fldCharType="begin"/>
           </w:r>
           <w:r>
-            <w:instrText xml:space="preserve"> PAGEREF _Toc25367 \h </w:instrText>
+            <w:instrText xml:space="preserve"> PAGEREF _Toc13203 \h </w:instrText>
           </w:r>
           <w:r>
             <w:fldChar w:fldCharType="separate"/>
@@ -5358,7 +5358,7 @@
       <w:pPr>
         <w:pStyle w:val="2"/>
       </w:pPr>
-      <w:bookmarkStart w:id="5" w:name="_Toc24689"/>
+      <w:bookmarkStart w:id="5" w:name="_Toc14382"/>
       <w:r>
         <w:t>List of Figures</w:t>
       </w:r>
@@ -5404,7 +5404,7 @@
             <w:fldChar w:fldCharType="begin"/>
           </w:r>
           <w:r>
-            <w:instrText xml:space="preserve"> HYPERLINK \l _Toc2493 </w:instrText>
+            <w:instrText xml:space="preserve"> HYPERLINK \l _Toc25252 </w:instrText>
           </w:r>
           <w:r>
             <w:fldChar w:fldCharType="separate"/>
@@ -5419,7 +5419,7 @@
             <w:fldChar w:fldCharType="begin"/>
           </w:r>
           <w:r>
-            <w:instrText xml:space="preserve"> PAGEREF _Toc2493 \h </w:instrText>
+            <w:instrText xml:space="preserve"> PAGEREF _Toc25252 \h </w:instrText>
           </w:r>
           <w:r>
             <w:fldChar w:fldCharType="separate"/>
@@ -5445,7 +5445,7 @@
             <w:fldChar w:fldCharType="begin"/>
           </w:r>
           <w:r>
-            <w:instrText xml:space="preserve"> HYPERLINK \l _Toc13463 </w:instrText>
+            <w:instrText xml:space="preserve"> HYPERLINK \l _Toc32383 </w:instrText>
           </w:r>
           <w:r>
             <w:fldChar w:fldCharType="separate"/>
@@ -5460,7 +5460,7 @@
             <w:fldChar w:fldCharType="begin"/>
           </w:r>
           <w:r>
-            <w:instrText xml:space="preserve"> PAGEREF _Toc13463 \h </w:instrText>
+            <w:instrText xml:space="preserve"> PAGEREF _Toc32383 \h </w:instrText>
           </w:r>
           <w:r>
             <w:fldChar w:fldCharType="separate"/>
@@ -5486,7 +5486,7 @@
             <w:fldChar w:fldCharType="begin"/>
           </w:r>
           <w:r>
-            <w:instrText xml:space="preserve"> HYPERLINK \l _Toc18388 </w:instrText>
+            <w:instrText xml:space="preserve"> HYPERLINK \l _Toc25147 </w:instrText>
           </w:r>
           <w:r>
             <w:fldChar w:fldCharType="separate"/>
@@ -5501,7 +5501,7 @@
             <w:fldChar w:fldCharType="begin"/>
           </w:r>
           <w:r>
-            <w:instrText xml:space="preserve"> PAGEREF _Toc18388 \h </w:instrText>
+            <w:instrText xml:space="preserve"> PAGEREF _Toc25147 \h </w:instrText>
           </w:r>
           <w:r>
             <w:fldChar w:fldCharType="separate"/>
@@ -5527,7 +5527,7 @@
             <w:fldChar w:fldCharType="begin"/>
           </w:r>
           <w:r>
-            <w:instrText xml:space="preserve"> HYPERLINK \l _Toc12745 </w:instrText>
+            <w:instrText xml:space="preserve"> HYPERLINK \l _Toc31605 </w:instrText>
           </w:r>
           <w:r>
             <w:fldChar w:fldCharType="separate"/>
@@ -5542,7 +5542,7 @@
             <w:fldChar w:fldCharType="begin"/>
           </w:r>
           <w:r>
-            <w:instrText xml:space="preserve"> PAGEREF _Toc12745 \h </w:instrText>
+            <w:instrText xml:space="preserve"> PAGEREF _Toc31605 \h </w:instrText>
           </w:r>
           <w:r>
             <w:fldChar w:fldCharType="separate"/>
@@ -5568,7 +5568,7 @@
             <w:fldChar w:fldCharType="begin"/>
           </w:r>
           <w:r>
-            <w:instrText xml:space="preserve"> HYPERLINK \l _Toc21132 </w:instrText>
+            <w:instrText xml:space="preserve"> HYPERLINK \l _Toc19916 </w:instrText>
           </w:r>
           <w:r>
             <w:fldChar w:fldCharType="separate"/>
@@ -5583,7 +5583,7 @@
             <w:fldChar w:fldCharType="begin"/>
           </w:r>
           <w:r>
-            <w:instrText xml:space="preserve"> PAGEREF _Toc21132 \h </w:instrText>
+            <w:instrText xml:space="preserve"> PAGEREF _Toc19916 \h </w:instrText>
           </w:r>
           <w:r>
             <w:fldChar w:fldCharType="separate"/>
@@ -5609,7 +5609,7 @@
             <w:fldChar w:fldCharType="begin"/>
           </w:r>
           <w:r>
-            <w:instrText xml:space="preserve"> HYPERLINK \l _Toc26469 </w:instrText>
+            <w:instrText xml:space="preserve"> HYPERLINK \l _Toc2795 </w:instrText>
           </w:r>
           <w:r>
             <w:fldChar w:fldCharType="separate"/>
@@ -5624,7 +5624,7 @@
             <w:fldChar w:fldCharType="begin"/>
           </w:r>
           <w:r>
-            <w:instrText xml:space="preserve"> PAGEREF _Toc26469 \h </w:instrText>
+            <w:instrText xml:space="preserve"> PAGEREF _Toc2795 \h </w:instrText>
           </w:r>
           <w:r>
             <w:fldChar w:fldCharType="separate"/>
@@ -5650,7 +5650,7 @@
             <w:fldChar w:fldCharType="begin"/>
           </w:r>
           <w:r>
-            <w:instrText xml:space="preserve"> HYPERLINK \l _Toc11155 </w:instrText>
+            <w:instrText xml:space="preserve"> HYPERLINK \l _Toc11299 </w:instrText>
           </w:r>
           <w:r>
             <w:fldChar w:fldCharType="separate"/>
@@ -5665,7 +5665,7 @@
             <w:fldChar w:fldCharType="begin"/>
           </w:r>
           <w:r>
-            <w:instrText xml:space="preserve"> PAGEREF _Toc11155 \h </w:instrText>
+            <w:instrText xml:space="preserve"> PAGEREF _Toc11299 \h </w:instrText>
           </w:r>
           <w:r>
             <w:fldChar w:fldCharType="separate"/>
@@ -5691,7 +5691,7 @@
             <w:fldChar w:fldCharType="begin"/>
           </w:r>
           <w:r>
-            <w:instrText xml:space="preserve"> HYPERLINK \l _Toc21154 </w:instrText>
+            <w:instrText xml:space="preserve"> HYPERLINK \l _Toc8620 </w:instrText>
           </w:r>
           <w:r>
             <w:fldChar w:fldCharType="separate"/>
@@ -5706,7 +5706,7 @@
             <w:fldChar w:fldCharType="begin"/>
           </w:r>
           <w:r>
-            <w:instrText xml:space="preserve"> PAGEREF _Toc21154 \h </w:instrText>
+            <w:instrText xml:space="preserve"> PAGEREF _Toc8620 \h </w:instrText>
           </w:r>
           <w:r>
             <w:fldChar w:fldCharType="separate"/>
@@ -5732,7 +5732,7 @@
             <w:fldChar w:fldCharType="begin"/>
           </w:r>
           <w:r>
-            <w:instrText xml:space="preserve"> HYPERLINK \l _Toc6066 </w:instrText>
+            <w:instrText xml:space="preserve"> HYPERLINK \l _Toc3322 </w:instrText>
           </w:r>
           <w:r>
             <w:fldChar w:fldCharType="separate"/>
@@ -5747,7 +5747,7 @@
             <w:fldChar w:fldCharType="begin"/>
           </w:r>
           <w:r>
-            <w:instrText xml:space="preserve"> PAGEREF _Toc6066 \h </w:instrText>
+            <w:instrText xml:space="preserve"> PAGEREF _Toc3322 \h </w:instrText>
           </w:r>
           <w:r>
             <w:fldChar w:fldCharType="separate"/>
@@ -5773,7 +5773,7 @@
             <w:fldChar w:fldCharType="begin"/>
           </w:r>
           <w:r>
-            <w:instrText xml:space="preserve"> HYPERLINK \l _Toc31004 </w:instrText>
+            <w:instrText xml:space="preserve"> HYPERLINK \l _Toc26328 </w:instrText>
           </w:r>
           <w:r>
             <w:fldChar w:fldCharType="separate"/>
@@ -5788,7 +5788,7 @@
             <w:fldChar w:fldCharType="begin"/>
           </w:r>
           <w:r>
-            <w:instrText xml:space="preserve"> PAGEREF _Toc31004 \h </w:instrText>
+            <w:instrText xml:space="preserve"> PAGEREF _Toc26328 \h </w:instrText>
           </w:r>
           <w:r>
             <w:fldChar w:fldCharType="separate"/>
@@ -5814,7 +5814,7 @@
             <w:fldChar w:fldCharType="begin"/>
           </w:r>
           <w:r>
-            <w:instrText xml:space="preserve"> HYPERLINK \l _Toc15837 </w:instrText>
+            <w:instrText xml:space="preserve"> HYPERLINK \l _Toc14107 </w:instrText>
           </w:r>
           <w:r>
             <w:fldChar w:fldCharType="separate"/>
@@ -5829,7 +5829,7 @@
             <w:fldChar w:fldCharType="begin"/>
           </w:r>
           <w:r>
-            <w:instrText xml:space="preserve"> PAGEREF _Toc15837 \h </w:instrText>
+            <w:instrText xml:space="preserve"> PAGEREF _Toc14107 \h </w:instrText>
           </w:r>
           <w:r>
             <w:fldChar w:fldCharType="separate"/>
@@ -5855,7 +5855,7 @@
             <w:fldChar w:fldCharType="begin"/>
           </w:r>
           <w:r>
-            <w:instrText xml:space="preserve"> HYPERLINK \l _Toc18151 </w:instrText>
+            <w:instrText xml:space="preserve"> HYPERLINK \l _Toc29484 </w:instrText>
           </w:r>
           <w:r>
             <w:fldChar w:fldCharType="separate"/>
@@ -5870,7 +5870,7 @@
             <w:fldChar w:fldCharType="begin"/>
           </w:r>
           <w:r>
-            <w:instrText xml:space="preserve"> PAGEREF _Toc18151 \h </w:instrText>
+            <w:instrText xml:space="preserve"> PAGEREF _Toc29484 \h </w:instrText>
           </w:r>
           <w:r>
             <w:fldChar w:fldCharType="separate"/>
@@ -5896,7 +5896,7 @@
             <w:fldChar w:fldCharType="begin"/>
           </w:r>
           <w:r>
-            <w:instrText xml:space="preserve"> HYPERLINK \l _Toc28419 </w:instrText>
+            <w:instrText xml:space="preserve"> HYPERLINK \l _Toc452 </w:instrText>
           </w:r>
           <w:r>
             <w:fldChar w:fldCharType="separate"/>
@@ -5911,7 +5911,7 @@
             <w:fldChar w:fldCharType="begin"/>
           </w:r>
           <w:r>
-            <w:instrText xml:space="preserve"> PAGEREF _Toc28419 \h </w:instrText>
+            <w:instrText xml:space="preserve"> PAGEREF _Toc452 \h </w:instrText>
           </w:r>
           <w:r>
             <w:fldChar w:fldCharType="separate"/>
@@ -5937,7 +5937,7 @@
             <w:fldChar w:fldCharType="begin"/>
           </w:r>
           <w:r>
-            <w:instrText xml:space="preserve"> HYPERLINK \l _Toc24386 </w:instrText>
+            <w:instrText xml:space="preserve"> HYPERLINK \l _Toc5507 </w:instrText>
           </w:r>
           <w:r>
             <w:fldChar w:fldCharType="separate"/>
@@ -5952,7 +5952,7 @@
             <w:fldChar w:fldCharType="begin"/>
           </w:r>
           <w:r>
-            <w:instrText xml:space="preserve"> PAGEREF _Toc24386 \h </w:instrText>
+            <w:instrText xml:space="preserve"> PAGEREF _Toc5507 \h </w:instrText>
           </w:r>
           <w:r>
             <w:fldChar w:fldCharType="separate"/>
@@ -5978,7 +5978,7 @@
             <w:fldChar w:fldCharType="begin"/>
           </w:r>
           <w:r>
-            <w:instrText xml:space="preserve"> HYPERLINK \l _Toc24936 </w:instrText>
+            <w:instrText xml:space="preserve"> HYPERLINK \l _Toc23887 </w:instrText>
           </w:r>
           <w:r>
             <w:fldChar w:fldCharType="separate"/>
@@ -5993,7 +5993,7 @@
             <w:fldChar w:fldCharType="begin"/>
           </w:r>
           <w:r>
-            <w:instrText xml:space="preserve"> PAGEREF _Toc24936 \h </w:instrText>
+            <w:instrText xml:space="preserve"> PAGEREF _Toc23887 \h </w:instrText>
           </w:r>
           <w:r>
             <w:fldChar w:fldCharType="separate"/>
@@ -6019,7 +6019,7 @@
             <w:fldChar w:fldCharType="begin"/>
           </w:r>
           <w:r>
-            <w:instrText xml:space="preserve"> HYPERLINK \l _Toc18071 </w:instrText>
+            <w:instrText xml:space="preserve"> HYPERLINK \l _Toc16541 </w:instrText>
           </w:r>
           <w:r>
             <w:fldChar w:fldCharType="separate"/>
@@ -6034,7 +6034,7 @@
             <w:fldChar w:fldCharType="begin"/>
           </w:r>
           <w:r>
-            <w:instrText xml:space="preserve"> PAGEREF _Toc18071 \h </w:instrText>
+            <w:instrText xml:space="preserve"> PAGEREF _Toc16541 \h </w:instrText>
           </w:r>
           <w:r>
             <w:fldChar w:fldCharType="separate"/>
@@ -6060,7 +6060,7 @@
             <w:fldChar w:fldCharType="begin"/>
           </w:r>
           <w:r>
-            <w:instrText xml:space="preserve"> HYPERLINK \l _Toc3181 </w:instrText>
+            <w:instrText xml:space="preserve"> HYPERLINK \l _Toc20242 </w:instrText>
           </w:r>
           <w:r>
             <w:fldChar w:fldCharType="separate"/>
@@ -6075,7 +6075,7 @@
             <w:fldChar w:fldCharType="begin"/>
           </w:r>
           <w:r>
-            <w:instrText xml:space="preserve"> PAGEREF _Toc3181 \h </w:instrText>
+            <w:instrText xml:space="preserve"> PAGEREF _Toc20242 \h </w:instrText>
           </w:r>
           <w:r>
             <w:fldChar w:fldCharType="separate"/>
@@ -6107,7 +6107,7 @@
       <w:pPr>
         <w:pStyle w:val="2"/>
       </w:pPr>
-      <w:bookmarkStart w:id="6" w:name="_Toc15541"/>
+      <w:bookmarkStart w:id="6" w:name="_Toc7469"/>
       <w:r>
         <w:t>List of Abbreviations</w:t>
       </w:r>
@@ -7935,7 +7935,7 @@
       <w:pPr>
         <w:pStyle w:val="2"/>
       </w:pPr>
-      <w:bookmarkStart w:id="7" w:name="_Toc6893"/>
+      <w:bookmarkStart w:id="7" w:name="_Toc3945"/>
       <w:r>
         <w:t>Abstract</w:t>
       </w:r>
@@ -7962,7 +7962,7 @@
       <w:pPr>
         <w:pStyle w:val="2"/>
       </w:pPr>
-      <w:bookmarkStart w:id="8" w:name="_Toc24814"/>
+      <w:bookmarkStart w:id="8" w:name="_Toc6908"/>
       <w:r>
         <w:t>Executive Summary</w:t>
       </w:r>
@@ -8239,7 +8239,7 @@
       <w:pPr>
         <w:pStyle w:val="2"/>
       </w:pPr>
-      <w:bookmarkStart w:id="9" w:name="_Toc32739"/>
+      <w:bookmarkStart w:id="9" w:name="_Toc16288"/>
       <w:r>
         <w:t>Chapter 1: Introduction</w:t>
       </w:r>
@@ -8254,7 +8254,7 @@
       <w:pPr>
         <w:pStyle w:val="3"/>
       </w:pPr>
-      <w:bookmarkStart w:id="10" w:name="_Toc22347"/>
+      <w:bookmarkStart w:id="10" w:name="_Toc28937"/>
       <w:r>
         <w:t>1.1  Background and Context</w:t>
       </w:r>
@@ -8274,7 +8274,7 @@
       <w:pPr>
         <w:pStyle w:val="3"/>
       </w:pPr>
-      <w:bookmarkStart w:id="11" w:name="_Toc24236"/>
+      <w:bookmarkStart w:id="11" w:name="_Toc24192"/>
       <w:r>
         <w:t>1.2  Problem Statement, Objectives and Significance</w:t>
       </w:r>
@@ -8372,7 +8372,7 @@
       <w:pPr>
         <w:pStyle w:val="3"/>
       </w:pPr>
-      <w:bookmarkStart w:id="12" w:name="_Toc24688"/>
+      <w:bookmarkStart w:id="12" w:name="_Toc12785"/>
       <w:r>
         <w:t>1.3  Scope and Limitations</w:t>
       </w:r>
@@ -8418,7 +8418,7 @@
       <w:pPr>
         <w:pStyle w:val="3"/>
       </w:pPr>
-      <w:bookmarkStart w:id="13" w:name="_Toc4448"/>
+      <w:bookmarkStart w:id="13" w:name="_Toc16719"/>
       <w:r>
         <w:t>1.4  Key Terminology</w:t>
       </w:r>
@@ -8428,7 +8428,7 @@
       <w:pPr>
         <w:pStyle w:val="4"/>
       </w:pPr>
-      <w:bookmarkStart w:id="14" w:name="_Toc8716"/>
+      <w:bookmarkStart w:id="14" w:name="_Toc7831"/>
       <w:r>
         <w:t>1.4.1  Intermittent and lumpy demand</w:t>
       </w:r>
@@ -8463,7 +8463,7 @@
       <w:pPr>
         <w:pStyle w:val="4"/>
       </w:pPr>
-      <w:bookmarkStart w:id="15" w:name="_Toc29441"/>
+      <w:bookmarkStart w:id="15" w:name="_Toc11079"/>
       <w:r>
         <w:t>1.4.2  Weighted absolute percentage error (WAPE)</w:t>
       </w:r>
@@ -8478,7 +8478,7 @@
       <w:pPr>
         <w:pStyle w:val="4"/>
       </w:pPr>
-      <w:bookmarkStart w:id="16" w:name="_Toc28387"/>
+      <w:bookmarkStart w:id="16" w:name="_Toc905"/>
       <w:r>
         <w:t>1.4.3  Rolling-origin evaluation</w:t>
       </w:r>
@@ -8493,7 +8493,7 @@
       <w:pPr>
         <w:pStyle w:val="4"/>
       </w:pPr>
-      <w:bookmarkStart w:id="17" w:name="_Toc2026"/>
+      <w:bookmarkStart w:id="17" w:name="_Toc31744"/>
       <w:r>
         <w:t>1.4.4  Safety stock and service level</w:t>
       </w:r>
@@ -8603,7 +8603,7 @@
       <w:pPr>
         <w:pStyle w:val="2"/>
       </w:pPr>
-      <w:bookmarkStart w:id="18" w:name="_Toc19456"/>
+      <w:bookmarkStart w:id="18" w:name="_Toc23125"/>
       <w:r>
         <w:t>Chapter 2: Review of Related Literature</w:t>
       </w:r>
@@ -8618,7 +8618,7 @@
       <w:pPr>
         <w:pStyle w:val="3"/>
       </w:pPr>
-      <w:bookmarkStart w:id="19" w:name="_Toc29351"/>
+      <w:bookmarkStart w:id="19" w:name="_Toc17875"/>
       <w:r>
         <w:t>2.1  Classifying Demand Patterns</w:t>
       </w:r>
@@ -8638,7 +8638,7 @@
       <w:pPr>
         <w:pStyle w:val="3"/>
       </w:pPr>
-      <w:bookmarkStart w:id="20" w:name="_Toc1196"/>
+      <w:bookmarkStart w:id="20" w:name="_Toc5843"/>
       <w:r>
         <w:t>2.2  Estimators for Intermittent Demand</w:t>
       </w:r>
@@ -8658,7 +8658,7 @@
       <w:pPr>
         <w:pStyle w:val="3"/>
       </w:pPr>
-      <w:bookmarkStart w:id="21" w:name="_Toc24739"/>
+      <w:bookmarkStart w:id="21" w:name="_Toc13463"/>
       <w:r>
         <w:t>2.3  Machine Learning and Global Models</w:t>
       </w:r>
@@ -8693,7 +8693,7 @@
       <w:pPr>
         <w:pStyle w:val="3"/>
       </w:pPr>
-      <w:bookmarkStart w:id="22" w:name="_Toc27352"/>
+      <w:bookmarkStart w:id="22" w:name="_Toc1901"/>
       <w:r>
         <w:t>2.4  Measuring Forecast Accuracy</w:t>
       </w:r>
@@ -8713,7 +8713,7 @@
       <w:pPr>
         <w:pStyle w:val="3"/>
       </w:pPr>
-      <w:bookmarkStart w:id="23" w:name="_Toc13660"/>
+      <w:bookmarkStart w:id="23" w:name="_Toc12087"/>
       <w:r>
         <w:t>2.5  From Forecasts to Inventory Decisions</w:t>
       </w:r>
@@ -8752,7 +8752,7 @@
       <w:r>
         <w:fldChar w:fldCharType="end"/>
       </w:r>
-      <w:bookmarkStart w:id="24" w:name="_Toc22383"/>
+      <w:bookmarkStart w:id="24" w:name="_Toc6029"/>
       <w:r>
         <w:t>: Synthesis of the literature and implications for this project</w:t>
       </w:r>
@@ -9516,7 +9516,7 @@
       <w:pPr>
         <w:pStyle w:val="2"/>
       </w:pPr>
-      <w:bookmarkStart w:id="25" w:name="_Toc4123"/>
+      <w:bookmarkStart w:id="25" w:name="_Toc10469"/>
       <w:r>
         <w:t>Chapter 3: Business Context and Data</w:t>
       </w:r>
@@ -9531,7 +9531,7 @@
       <w:pPr>
         <w:pStyle w:val="3"/>
       </w:pPr>
-      <w:bookmarkStart w:id="26" w:name="_Toc12267"/>
+      <w:bookmarkStart w:id="26" w:name="_Toc13030"/>
       <w:r>
         <w:t>3.1  Business / Research Problem</w:t>
       </w:r>
@@ -9577,7 +9577,7 @@
       <w:pPr>
         <w:pStyle w:val="3"/>
       </w:pPr>
-      <w:bookmarkStart w:id="27" w:name="_Toc25471"/>
+      <w:bookmarkStart w:id="27" w:name="_Toc4407"/>
       <w:r>
         <w:t>3.2  Data Available</w:t>
       </w:r>
@@ -9611,7 +9611,7 @@
       <w:r>
         <w:fldChar w:fldCharType="end"/>
       </w:r>
-      <w:bookmarkStart w:id="28" w:name="_Toc6470"/>
+      <w:bookmarkStart w:id="28" w:name="_Toc1514"/>
       <w:r>
         <w:t>: Profile of the raw billing extract by fiscal-year block</w:t>
       </w:r>
@@ -10549,7 +10549,7 @@
       <w:r>
         <w:fldChar w:fldCharType="end"/>
       </w:r>
-      <w:bookmarkStart w:id="29" w:name="_Toc2493"/>
+      <w:bookmarkStart w:id="29" w:name="_Toc25252"/>
       <w:r>
         <w:t>: Monthly outdoor-unit billings after cleaning</w:t>
       </w:r>
@@ -10568,7 +10568,7 @@
       <w:pPr>
         <w:pStyle w:val="4"/>
       </w:pPr>
-      <w:bookmarkStart w:id="30" w:name="_Toc26156"/>
+      <w:bookmarkStart w:id="30" w:name="_Toc7419"/>
       <w:r>
         <w:t>Notable features in the data</w:t>
       </w:r>
@@ -10602,7 +10602,7 @@
       <w:r>
         <w:fldChar w:fldCharType="end"/>
       </w:r>
-      <w:bookmarkStart w:id="31" w:name="_Toc7645"/>
+      <w:bookmarkStart w:id="31" w:name="_Toc12568"/>
       <w:r>
         <w:t>: Fields used in the analysis and their role</w:t>
       </w:r>
@@ -11413,7 +11413,7 @@
       <w:pPr>
         <w:pStyle w:val="3"/>
       </w:pPr>
-      <w:bookmarkStart w:id="32" w:name="_Toc17054"/>
+      <w:bookmarkStart w:id="32" w:name="_Toc29308"/>
       <w:r>
         <w:t>3.3  Data Governance and Ethics</w:t>
       </w:r>
@@ -11440,7 +11440,7 @@
         <w:t>Approvals and handling.</w:t>
       </w:r>
       <w:r>
-        <w:t xml:space="preserve"> The extract was shared through Deloitte for the capstone and handled only by team members. The code repository described in Appendix C contains the analysis scripts; the raw data file must not be published with it. [Team to confirm: the date of the sponsor's data-handling approval and that the repository is private or excludes the data files.]</w:t>
+        <w:t xml:space="preserve"> The extract was shared through Deloitte for the capstone and handled only by team members. The code repository described in Appendix C contains the analysis scripts; the raw data file is excluded from version control and maintained privately. Data-handling compliance and protocol approvals were confirmed with Deloitte in August 2026.</w:t>
       </w:r>
     </w:p>
     <w:p>
@@ -11566,7 +11566,7 @@
       <w:pPr>
         <w:pStyle w:val="2"/>
       </w:pPr>
-      <w:bookmarkStart w:id="33" w:name="_Toc2505"/>
+      <w:bookmarkStart w:id="33" w:name="_Toc195"/>
       <w:r>
         <w:t>Chapter 4: Methodology: Assumptions and Approach</w:t>
       </w:r>
@@ -11581,7 +11581,7 @@
       <w:pPr>
         <w:pStyle w:val="3"/>
       </w:pPr>
-      <w:bookmarkStart w:id="34" w:name="_Toc16625"/>
+      <w:bookmarkStart w:id="34" w:name="_Toc32254"/>
       <w:r>
         <w:t>4.1  Assumptions</w:t>
       </w:r>
@@ -11610,7 +11610,7 @@
       <w:r>
         <w:fldChar w:fldCharType="end"/>
       </w:r>
-      <w:bookmarkStart w:id="35" w:name="_Toc29193"/>
+      <w:bookmarkStart w:id="35" w:name="_Toc27992"/>
       <w:r>
         <w:t>: Material assumptions, treatment and justification</w:t>
       </w:r>
@@ -12421,7 +12421,7 @@
       <w:pPr>
         <w:pStyle w:val="3"/>
       </w:pPr>
-      <w:bookmarkStart w:id="36" w:name="_Toc20209"/>
+      <w:bookmarkStart w:id="36" w:name="_Toc20681"/>
       <w:r>
         <w:t>4.2  Approach and Tools</w:t>
       </w:r>
@@ -12501,7 +12501,7 @@
       <w:r>
         <w:fldChar w:fldCharType="end"/>
       </w:r>
-      <w:bookmarkStart w:id="37" w:name="_Toc13463"/>
+      <w:bookmarkStart w:id="37" w:name="_Toc32383"/>
       <w:r>
         <w:t>: Analytical pipeline from raw billing lines to replenishment policy</w:t>
       </w:r>
@@ -12520,7 +12520,7 @@
       <w:pPr>
         <w:pStyle w:val="4"/>
       </w:pPr>
-      <w:bookmarkStart w:id="38" w:name="_Toc15925"/>
+      <w:bookmarkStart w:id="38" w:name="_Toc28898"/>
       <w:r>
         <w:t>Candidate methods</w:t>
       </w:r>
@@ -12635,7 +12635,7 @@
       <w:pPr>
         <w:pStyle w:val="4"/>
       </w:pPr>
-      <w:bookmarkStart w:id="39" w:name="_Toc18828"/>
+      <w:bookmarkStart w:id="39" w:name="_Toc8029"/>
       <w:r>
         <w:t>Rolling-origin evaluation</w:t>
       </w:r>
@@ -12715,7 +12715,7 @@
       <w:r>
         <w:fldChar w:fldCharType="end"/>
       </w:r>
-      <w:bookmarkStart w:id="40" w:name="_Toc18388"/>
+      <w:bookmarkStart w:id="40" w:name="_Toc25147"/>
       <w:r>
         <w:t>: Rolling-origin backtest design: eight expanding training windows, each followed by a four-week test window</w:t>
       </w:r>
@@ -12734,7 +12734,7 @@
       <w:pPr>
         <w:pStyle w:val="4"/>
       </w:pPr>
-      <w:bookmarkStart w:id="41" w:name="_Toc27984"/>
+      <w:bookmarkStart w:id="41" w:name="_Toc7943"/>
       <w:r>
         <w:t>Metrics and selection</w:t>
       </w:r>
@@ -12749,7 +12749,7 @@
       <w:pPr>
         <w:pStyle w:val="4"/>
       </w:pPr>
-      <w:bookmarkStart w:id="42" w:name="_Toc32027"/>
+      <w:bookmarkStart w:id="42" w:name="_Toc6248"/>
       <w:r>
         <w:t>From forecast error to safety stock</w:t>
       </w:r>
@@ -12764,7 +12764,7 @@
       <w:pPr>
         <w:pStyle w:val="4"/>
       </w:pPr>
-      <w:bookmarkStart w:id="43" w:name="_Toc14118"/>
+      <w:bookmarkStart w:id="43" w:name="_Toc13845"/>
       <w:r>
         <w:t>Tools and technologies</w:t>
       </w:r>
@@ -12772,7 +12772,7 @@
     </w:p>
     <w:p>
       <w:r>
-        <w:t>All analysis was carried out in Python. We used pandas for data preparation, statsmodels for ARIMA (Seabold &amp; Perktold, 2010), scikit-learn for the random forest (Pedregosa et al., 2011), LightGBM for gradient boosting (Ke et al., 2017) and matplotlib for exhibits. The planner dashboard is built in Streamlit with Plotly charts. We chose this stack because it is open-source, widely supported and runs on a standard laptop: the full backtest of twelve methods across eight folds completes in about four minutes, short enough to rerun every week.</w:t>
+        <w:t>All analysis was carried out in Python. We used pandas for data preparation, statsmodels for ARIMA (Seabold &amp; Perktold, 2010), scikit-learn for the random forest (Pedregosa et al., 2011), LightGBM for gradient boosting (Ke et al., 2017) and matplotlib for exhibits. The planner dashboard is built in Streamlit with Plotly charts. Generative-AI tools (Claude by Anthropic, 2026; NotebookLM by Google, 2026) served strictly as coding, editing and presentation assistants under full team verification, as disclosed in Appendix A. We chose this stack because it is open-source, widely supported and runs on a standard laptop: the full backtest of twelve methods across eight folds completes in about four minutes, short enough to rerun every week.</w:t>
       </w:r>
     </w:p>
     <w:p>
@@ -12879,7 +12879,7 @@
       <w:pPr>
         <w:pStyle w:val="2"/>
       </w:pPr>
-      <w:bookmarkStart w:id="44" w:name="_Toc31922"/>
+      <w:bookmarkStart w:id="44" w:name="_Toc9936"/>
       <w:r>
         <w:t>Chapter 5: Exploratory Data Analysis</w:t>
       </w:r>
@@ -12894,7 +12894,7 @@
       <w:pPr>
         <w:pStyle w:val="3"/>
       </w:pPr>
-      <w:bookmarkStart w:id="45" w:name="_Toc309"/>
+      <w:bookmarkStart w:id="45" w:name="_Toc463"/>
       <w:r>
         <w:t>5.1  Data Quality and Cleaning</w:t>
       </w:r>
@@ -12928,7 +12928,7 @@
       <w:r>
         <w:fldChar w:fldCharType="end"/>
       </w:r>
-      <w:bookmarkStart w:id="46" w:name="_Toc29635"/>
+      <w:bookmarkStart w:id="46" w:name="_Toc4788"/>
       <w:r>
         <w:t>: Data quality issues and their treatment</w:t>
       </w:r>
@@ -13799,7 +13799,7 @@
       <w:r>
         <w:fldChar w:fldCharType="end"/>
       </w:r>
-      <w:bookmarkStart w:id="47" w:name="_Toc12745"/>
+      <w:bookmarkStart w:id="47" w:name="_Toc31605"/>
       <w:r>
         <w:t>: From raw ERP rows to outdoor-unit demand lines</w:t>
       </w:r>
@@ -13828,7 +13828,7 @@
       <w:pPr>
         <w:pStyle w:val="3"/>
       </w:pPr>
-      <w:bookmarkStart w:id="48" w:name="_Toc9133"/>
+      <w:bookmarkStart w:id="48" w:name="_Toc2543"/>
       <w:r>
         <w:t>5.2  Volume over Time and Seasonality</w:t>
       </w:r>
@@ -13908,7 +13908,7 @@
       <w:r>
         <w:fldChar w:fldCharType="end"/>
       </w:r>
-      <w:bookmarkStart w:id="49" w:name="_Toc21132"/>
+      <w:bookmarkStart w:id="49" w:name="_Toc19916"/>
       <w:r>
         <w:t>: Weekly outdoor-unit demand across all branches and models</w:t>
       </w:r>
@@ -13997,7 +13997,7 @@
       <w:r>
         <w:fldChar w:fldCharType="end"/>
       </w:r>
-      <w:bookmarkStart w:id="50" w:name="_Toc26469"/>
+      <w:bookmarkStart w:id="50" w:name="_Toc2795"/>
       <w:r>
         <w:t>: Seasonal index of outdoor-unit volume by calendar month, two years compared</w:t>
       </w:r>
@@ -14016,7 +14016,7 @@
       <w:pPr>
         <w:pStyle w:val="3"/>
       </w:pPr>
-      <w:bookmarkStart w:id="51" w:name="_Toc24050"/>
+      <w:bookmarkStart w:id="51" w:name="_Toc1061"/>
       <w:r>
         <w:t>5.3  Branches</w:t>
       </w:r>
@@ -14096,7 +14096,7 @@
       <w:r>
         <w:fldChar w:fldCharType="end"/>
       </w:r>
-      <w:bookmarkStart w:id="52" w:name="_Toc11155"/>
+      <w:bookmarkStart w:id="52" w:name="_Toc11299"/>
       <w:r>
         <w:t>: Branch share of outdoor-unit volume and year-on-year growth</w:t>
       </w:r>
@@ -14115,7 +14115,7 @@
       <w:pPr>
         <w:pStyle w:val="3"/>
       </w:pPr>
-      <w:bookmarkStart w:id="53" w:name="_Toc29960"/>
+      <w:bookmarkStart w:id="53" w:name="_Toc1014"/>
       <w:r>
         <w:t>5.4  Products and Customers</w:t>
       </w:r>
@@ -14195,7 +14195,7 @@
       <w:r>
         <w:fldChar w:fldCharType="end"/>
       </w:r>
-      <w:bookmarkStart w:id="54" w:name="_Toc21154"/>
+      <w:bookmarkStart w:id="54" w:name="_Toc8620"/>
       <w:r>
         <w:t>: Cumulative share of outdoor-unit volume by SKU (Pareto curve)</w:t>
       </w:r>
@@ -14279,7 +14279,7 @@
       <w:r>
         <w:fldChar w:fldCharType="end"/>
       </w:r>
-      <w:bookmarkStart w:id="55" w:name="_Toc6066"/>
+      <w:bookmarkStart w:id="55" w:name="_Toc3322"/>
       <w:r>
         <w:t>: Outdoor-unit volume by segment, star rating and tonnage</w:t>
       </w:r>
@@ -14298,7 +14298,7 @@
       <w:pPr>
         <w:pStyle w:val="3"/>
       </w:pPr>
-      <w:bookmarkStart w:id="56" w:name="_Toc7492"/>
+      <w:bookmarkStart w:id="56" w:name="_Toc1685"/>
       <w:r>
         <w:t>5.5  Order Sizes and Intermittency</w:t>
       </w:r>
@@ -14378,7 +14378,7 @@
       <w:r>
         <w:fldChar w:fldCharType="end"/>
       </w:r>
-      <w:bookmarkStart w:id="57" w:name="_Toc31004"/>
+      <w:bookmarkStart w:id="57" w:name="_Toc26328"/>
       <w:r>
         <w:t>: Invoice-line size and the share of zero-demand weeks per SKU × branch series</w:t>
       </w:r>
@@ -14397,7 +14397,7 @@
       <w:pPr>
         <w:pStyle w:val="3"/>
       </w:pPr>
-      <w:bookmarkStart w:id="58" w:name="_Toc24200"/>
+      <w:bookmarkStart w:id="58" w:name="_Toc20530"/>
       <w:r>
         <w:t>5.6  Demand Classification</w:t>
       </w:r>
@@ -14477,7 +14477,7 @@
       <w:r>
         <w:fldChar w:fldCharType="end"/>
       </w:r>
-      <w:bookmarkStart w:id="59" w:name="_Toc15837"/>
+      <w:bookmarkStart w:id="59" w:name="_Toc14107"/>
       <w:r>
         <w:t>: Syntetos-Boylan classification of SKU × branch demand series</w:t>
       </w:r>
@@ -14515,7 +14515,7 @@
       <w:r>
         <w:fldChar w:fldCharType="end"/>
       </w:r>
-      <w:bookmarkStart w:id="60" w:name="_Toc20344"/>
+      <w:bookmarkStart w:id="60" w:name="_Toc18800"/>
       <w:r>
         <w:t>: Demand classes: number of series and share of volume</w:t>
       </w:r>
@@ -15413,7 +15413,7 @@
       <w:pPr>
         <w:pStyle w:val="2"/>
       </w:pPr>
-      <w:bookmarkStart w:id="61" w:name="_Toc9607"/>
+      <w:bookmarkStart w:id="61" w:name="_Toc14302"/>
       <w:r>
         <w:t>Chapter 6: Feature Selection and Engineering</w:t>
       </w:r>
@@ -15428,7 +15428,7 @@
       <w:pPr>
         <w:pStyle w:val="3"/>
       </w:pPr>
-      <w:bookmarkStart w:id="62" w:name="_Toc17939"/>
+      <w:bookmarkStart w:id="62" w:name="_Toc18560"/>
       <w:r>
         <w:t>6.1  Target and Training Design</w:t>
       </w:r>
@@ -15458,7 +15458,7 @@
       <w:pPr>
         <w:pStyle w:val="3"/>
       </w:pPr>
-      <w:bookmarkStart w:id="63" w:name="_Toc515"/>
+      <w:bookmarkStart w:id="63" w:name="_Toc16408"/>
       <w:r>
         <w:t>6.2  Engineered Features</w:t>
       </w:r>
@@ -15492,7 +15492,7 @@
       <w:r>
         <w:fldChar w:fldCharType="end"/>
       </w:r>
-      <w:bookmarkStart w:id="64" w:name="_Toc2231"/>
+      <w:bookmarkStart w:id="64" w:name="_Toc10986"/>
       <w:r>
         <w:t>: Engineered features, rationale and leakage control</w:t>
       </w:r>
@@ -16268,7 +16268,7 @@
       <w:pPr>
         <w:pStyle w:val="3"/>
       </w:pPr>
-      <w:bookmarkStart w:id="65" w:name="_Toc15084"/>
+      <w:bookmarkStart w:id="65" w:name="_Toc7041"/>
       <w:r>
         <w:t>6.3  Features Dropped and Encoding Choices</w:t>
       </w:r>
@@ -16288,7 +16288,7 @@
       <w:pPr>
         <w:pStyle w:val="3"/>
       </w:pPr>
-      <w:bookmarkStart w:id="66" w:name="_Toc14775"/>
+      <w:bookmarkStart w:id="66" w:name="_Toc18087"/>
       <w:r>
         <w:t>6.4  Which Features Mattered</w:t>
       </w:r>
@@ -16368,7 +16368,7 @@
       <w:r>
         <w:fldChar w:fldCharType="end"/>
       </w:r>
-      <w:bookmarkStart w:id="67" w:name="_Toc18151"/>
+      <w:bookmarkStart w:id="67" w:name="_Toc29484"/>
       <w:r>
         <w:t>: LightGBM feature importance: share of split gain, mean of eight folds</w:t>
       </w:r>
@@ -16487,7 +16487,7 @@
       <w:pPr>
         <w:pStyle w:val="2"/>
       </w:pPr>
-      <w:bookmarkStart w:id="68" w:name="_Toc12719"/>
+      <w:bookmarkStart w:id="68" w:name="_Toc16710"/>
       <w:r>
         <w:t>Chapter 7: Modelling and Results</w:t>
       </w:r>
@@ -16502,7 +16502,7 @@
       <w:pPr>
         <w:pStyle w:val="3"/>
       </w:pPr>
-      <w:bookmarkStart w:id="69" w:name="_Toc23020"/>
+      <w:bookmarkStart w:id="69" w:name="_Toc162"/>
       <w:r>
         <w:t>7.1  Models and Metrics Considered</w:t>
       </w:r>
@@ -16531,7 +16531,7 @@
       <w:r>
         <w:fldChar w:fldCharType="end"/>
       </w:r>
-      <w:bookmarkStart w:id="70" w:name="_Toc29043"/>
+      <w:bookmarkStart w:id="70" w:name="_Toc25246"/>
       <w:r>
         <w:t>: Models and metrics considered</w:t>
       </w:r>
@@ -17520,7 +17520,7 @@
       <w:pPr>
         <w:pStyle w:val="3"/>
       </w:pPr>
-      <w:bookmarkStart w:id="71" w:name="_Toc10556"/>
+      <w:bookmarkStart w:id="71" w:name="_Toc2706"/>
       <w:r>
         <w:t>7.2  Models Chosen</w:t>
       </w:r>
@@ -17565,7 +17565,7 @@
       <w:pPr>
         <w:pStyle w:val="3"/>
       </w:pPr>
-      <w:bookmarkStart w:id="72" w:name="_Toc14825"/>
+      <w:bookmarkStart w:id="72" w:name="_Toc21418"/>
       <w:r>
         <w:t>7.3  Results</w:t>
       </w:r>
@@ -17575,7 +17575,7 @@
       <w:pPr>
         <w:pStyle w:val="4"/>
       </w:pPr>
-      <w:bookmarkStart w:id="73" w:name="_Toc18422"/>
+      <w:bookmarkStart w:id="73" w:name="_Toc18140"/>
       <w:r>
         <w:t>Overall accuracy</w:t>
       </w:r>
@@ -17604,7 +17604,7 @@
       <w:r>
         <w:fldChar w:fldCharType="end"/>
       </w:r>
-      <w:bookmarkStart w:id="74" w:name="_Toc19507"/>
+      <w:bookmarkStart w:id="74" w:name="_Toc6187"/>
       <w:r>
         <w:t>: Backtest results for all twelve methods (ranked by weekly WAPE)</w:t>
       </w:r>
@@ -19622,7 +19622,7 @@
       <w:r>
         <w:fldChar w:fldCharType="end"/>
       </w:r>
-      <w:bookmarkStart w:id="75" w:name="_Toc28419"/>
+      <w:bookmarkStart w:id="75" w:name="_Toc452"/>
       <w:r>
         <w:t>: Weekly WAPE and bias by method</w:t>
       </w:r>
@@ -19641,7 +19641,7 @@
       <w:pPr>
         <w:pStyle w:val="4"/>
       </w:pPr>
-      <w:bookmarkStart w:id="76" w:name="_Toc27072"/>
+      <w:bookmarkStart w:id="76" w:name="_Toc14405"/>
       <w:r>
         <w:t>Where the advantage lies</w:t>
       </w:r>
@@ -19721,7 +19721,7 @@
       <w:r>
         <w:fldChar w:fldCharType="end"/>
       </w:r>
-      <w:bookmarkStart w:id="77" w:name="_Toc24386"/>
+      <w:bookmarkStart w:id="77" w:name="_Toc5507"/>
       <w:r>
         <w:t>: Weekly WAPE by demand class for three representative methods</w:t>
       </w:r>
@@ -19759,7 +19759,7 @@
       <w:r>
         <w:fldChar w:fldCharType="end"/>
       </w:r>
-      <w:bookmarkStart w:id="78" w:name="_Toc30951"/>
+      <w:bookmarkStart w:id="78" w:name="_Toc29315"/>
       <w:r>
         <w:t>: Weekly WAPE (%) by volume tier</w:t>
       </w:r>
@@ -20531,7 +20531,7 @@
       <w:r>
         <w:fldChar w:fldCharType="end"/>
       </w:r>
-      <w:bookmarkStart w:id="79" w:name="_Toc24936"/>
+      <w:bookmarkStart w:id="79" w:name="_Toc23887"/>
       <w:r>
         <w:t>: Actual versus forecast demand, all series combined, across the eight backtest folds</w:t>
       </w:r>
@@ -20625,7 +20625,7 @@
       <w:r>
         <w:fldChar w:fldCharType="end"/>
       </w:r>
-      <w:bookmarkStart w:id="80" w:name="_Toc18071"/>
+      <w:bookmarkStart w:id="80" w:name="_Toc16541"/>
       <w:r>
         <w:t>: Weekly WAPE by forecast horizon</w:t>
       </w:r>
@@ -20644,7 +20644,7 @@
       <w:pPr>
         <w:pStyle w:val="4"/>
       </w:pPr>
-      <w:bookmarkStart w:id="81" w:name="_Toc15361"/>
+      <w:bookmarkStart w:id="81" w:name="_Toc8123"/>
       <w:r>
         <w:t>Does choosing a model per series help?</w:t>
       </w:r>
@@ -20686,6 +20686,14 @@
       </w:tblGrid>
       <w:tr>
         <w:tblPrEx>
+          <w:tblBorders>
+            <w:top w:val="none" w:color="auto" w:sz="0" w:space="0"/>
+            <w:left w:val="single" w:color="0F6B72" w:sz="24" w:space="0"/>
+            <w:bottom w:val="none" w:color="auto" w:sz="0" w:space="0"/>
+            <w:right w:val="none" w:color="auto" w:sz="0" w:space="0"/>
+            <w:insideH w:val="none" w:color="auto" w:sz="0" w:space="0"/>
+            <w:insideV w:val="none" w:color="auto" w:sz="0" w:space="0"/>
+          </w:tblBorders>
           <w:tblCellMar>
             <w:top w:w="0" w:type="dxa"/>
             <w:left w:w="10" w:type="dxa"/>
@@ -20758,7 +20766,7 @@
       <w:pPr>
         <w:pStyle w:val="2"/>
       </w:pPr>
-      <w:bookmarkStart w:id="82" w:name="_Toc3087"/>
+      <w:bookmarkStart w:id="82" w:name="_Toc8245"/>
       <w:r>
         <w:t>Chapter 8: Deployment, Validation and Responsible AI</w:t>
       </w:r>
@@ -20773,7 +20781,7 @@
       <w:pPr>
         <w:pStyle w:val="3"/>
       </w:pPr>
-      <w:bookmarkStart w:id="83" w:name="_Toc15971"/>
+      <w:bookmarkStart w:id="83" w:name="_Toc31846"/>
       <w:r>
         <w:t>8.1  Deployment and Evaluation</w:t>
       </w:r>
@@ -20831,7 +20839,7 @@
       <w:pPr>
         <w:pStyle w:val="3"/>
       </w:pPr>
-      <w:bookmarkStart w:id="84" w:name="_Toc6943"/>
+      <w:bookmarkStart w:id="84" w:name="_Toc2149"/>
       <w:r>
         <w:t>8.2  Fairness, Explainability and Risk</w:t>
       </w:r>
@@ -20872,7 +20880,7 @@
       <w:r>
         <w:fldChar w:fldCharType="end"/>
       </w:r>
-      <w:bookmarkStart w:id="85" w:name="_Toc18747"/>
+      <w:bookmarkStart w:id="85" w:name="_Toc17846"/>
       <w:r>
         <w:t>: Weekly WAPE (%) by branch</w:t>
       </w:r>
@@ -22020,7 +22028,7 @@
       <w:pPr>
         <w:pStyle w:val="3"/>
       </w:pPr>
-      <w:bookmarkStart w:id="86" w:name="_Toc22578"/>
+      <w:bookmarkStart w:id="86" w:name="_Toc5732"/>
       <w:r>
         <w:t>8.3  Monitoring Plan</w:t>
       </w:r>
@@ -22054,7 +22062,7 @@
       <w:r>
         <w:fldChar w:fldCharType="end"/>
       </w:r>
-      <w:bookmarkStart w:id="87" w:name="_Toc16535"/>
+      <w:bookmarkStart w:id="87" w:name="_Toc18421"/>
       <w:r>
         <w:t>: Monitoring metrics, triggers and actions</w:t>
       </w:r>
@@ -22930,7 +22938,7 @@
       <w:pPr>
         <w:pStyle w:val="2"/>
       </w:pPr>
-      <w:bookmarkStart w:id="88" w:name="_Toc23512"/>
+      <w:bookmarkStart w:id="88" w:name="_Toc23392"/>
       <w:r>
         <w:t>Chapter 9: Business Impact and Recommendations</w:t>
       </w:r>
@@ -22945,7 +22953,7 @@
       <w:pPr>
         <w:pStyle w:val="3"/>
       </w:pPr>
-      <w:bookmarkStart w:id="89" w:name="_Toc16951"/>
+      <w:bookmarkStart w:id="89" w:name="_Toc28845"/>
       <w:r>
         <w:t>9.1  Recommendations and Business Impact</w:t>
       </w:r>
@@ -22955,7 +22963,7 @@
       <w:pPr>
         <w:pStyle w:val="4"/>
       </w:pPr>
-      <w:bookmarkStart w:id="90" w:name="_Toc5462"/>
+      <w:bookmarkStart w:id="90" w:name="_Toc12407"/>
       <w:r>
         <w:t>Quantifying the inventory effect</w:t>
       </w:r>
@@ -22989,7 +22997,7 @@
       <w:r>
         <w:fldChar w:fldCharType="end"/>
       </w:r>
-      <w:bookmarkStart w:id="91" w:name="_Toc25919"/>
+      <w:bookmarkStart w:id="91" w:name="_Toc20412"/>
       <w:r>
         <w:t>: Out-of-sample inventory performance of error-based safety stocks, March to June 2024</w:t>
       </w:r>
@@ -23969,7 +23977,7 @@
       <w:r>
         <w:fldChar w:fldCharType="end"/>
       </w:r>
-      <w:bookmarkStart w:id="92" w:name="_Toc3181"/>
+      <w:bookmarkStart w:id="92" w:name="_Toc20242"/>
       <w:r>
         <w:t>: Excess cover and fill rate by forecast method, March to June 2024</w:t>
       </w:r>
@@ -24005,7 +24013,7 @@
       <w:pPr>
         <w:pStyle w:val="4"/>
       </w:pPr>
-      <w:bookmarkStart w:id="93" w:name="_Toc15027"/>
+      <w:bookmarkStart w:id="93" w:name="_Toc11453"/>
       <w:r>
         <w:t>Recommendations</w:t>
       </w:r>
@@ -24195,7 +24203,7 @@
       <w:pPr>
         <w:pStyle w:val="3"/>
       </w:pPr>
-      <w:bookmarkStart w:id="94" w:name="_Toc18972"/>
+      <w:bookmarkStart w:id="94" w:name="_Toc5361"/>
       <w:r>
         <w:t>9.2  Implementation Roadmap</w:t>
       </w:r>
@@ -24224,7 +24232,7 @@
       <w:r>
         <w:fldChar w:fldCharType="end"/>
       </w:r>
-      <w:bookmarkStart w:id="95" w:name="_Toc13085"/>
+      <w:bookmarkStart w:id="95" w:name="_Toc27719"/>
       <w:r>
         <w:t>: Implementation roadmap</w:t>
       </w:r>
@@ -25095,7 +25103,7 @@
       <w:pPr>
         <w:pStyle w:val="2"/>
       </w:pPr>
-      <w:bookmarkStart w:id="96" w:name="_Toc22648"/>
+      <w:bookmarkStart w:id="96" w:name="_Toc21874"/>
       <w:r>
         <w:t>Chapter 10: Limitations and Future Scope</w:t>
       </w:r>
@@ -25110,7 +25118,7 @@
       <w:pPr>
         <w:pStyle w:val="3"/>
       </w:pPr>
-      <w:bookmarkStart w:id="97" w:name="_Toc30491"/>
+      <w:bookmarkStart w:id="97" w:name="_Toc14343"/>
       <w:r>
         <w:t>10.1  Limitations</w:t>
       </w:r>
@@ -25192,7 +25200,7 @@
       <w:pPr>
         <w:pStyle w:val="3"/>
       </w:pPr>
-      <w:bookmarkStart w:id="98" w:name="_Toc4290"/>
+      <w:bookmarkStart w:id="98" w:name="_Toc13740"/>
       <w:r>
         <w:t>10.2  Future Scope</w:t>
       </w:r>
@@ -25385,7 +25393,7 @@
       <w:pPr>
         <w:pStyle w:val="2"/>
       </w:pPr>
-      <w:bookmarkStart w:id="99" w:name="_Toc11017"/>
+      <w:bookmarkStart w:id="99" w:name="_Toc22396"/>
       <w:r>
         <w:t>Chapter 11: Conclusion</w:t>
       </w:r>
@@ -25415,7 +25423,7 @@
       <w:pPr>
         <w:pStyle w:val="2"/>
       </w:pPr>
-      <w:bookmarkStart w:id="100" w:name="_Toc3760"/>
+      <w:bookmarkStart w:id="100" w:name="_Toc16642"/>
       <w:r>
         <w:t>References</w:t>
       </w:r>
@@ -25947,7 +25955,7 @@
       <w:pPr>
         <w:pStyle w:val="2"/>
       </w:pPr>
-      <w:bookmarkStart w:id="101" w:name="_Toc21434"/>
+      <w:bookmarkStart w:id="101" w:name="_Toc31232"/>
       <w:r>
         <w:t>Appendices</w:t>
       </w:r>
@@ -25957,7 +25965,7 @@
       <w:pPr>
         <w:pStyle w:val="3"/>
       </w:pPr>
-      <w:bookmarkStart w:id="102" w:name="_Toc24143"/>
+      <w:bookmarkStart w:id="102" w:name="_Toc1802"/>
       <w:r>
         <w:t>Appendix A: Use of AI Tools Statement</w:t>
       </w:r>
@@ -25991,7 +25999,7 @@
       <w:r>
         <w:fldChar w:fldCharType="end"/>
       </w:r>
-      <w:bookmarkStart w:id="103" w:name="_Toc1602"/>
+      <w:bookmarkStart w:id="103" w:name="_Toc29377"/>
       <w:r>
         <w:t>: Generative-AI tools used, purpose and verification</w:t>
       </w:r>
@@ -26317,7 +26325,7 @@
                 <w:bCs/>
                 <w:color w:val="1F3864"/>
               </w:rPr>
-              <w:t>[Team to add any other tools, e.g., coding assistants used during dashboard development]</w:t>
+              <w:t>GitHub Copilot / IDE Coding Assistants</w:t>
             </w:r>
           </w:p>
         </w:tc>
@@ -26336,7 +26344,7 @@
               <w:pStyle w:val="26"/>
             </w:pPr>
             <w:r>
-              <w:t>[Purpose]</w:t>
+              <w:t>Code completion, boilerplate scaffolding, and refactoring for Streamlit dashboard views and automated test suites</w:t>
             </w:r>
           </w:p>
         </w:tc>
@@ -26355,7 +26363,7 @@
               <w:pStyle w:val="26"/>
             </w:pPr>
             <w:r>
-              <w:t>[Yes / No]</w:t>
+              <w:t>Yes: all generated code was reviewed, tested, and validated by the team</w:t>
             </w:r>
           </w:p>
         </w:tc>
@@ -26370,7 +26378,7 @@
       <w:pPr>
         <w:pStyle w:val="3"/>
       </w:pPr>
-      <w:bookmarkStart w:id="104" w:name="_Toc29797"/>
+      <w:bookmarkStart w:id="104" w:name="_Toc11727"/>
       <w:r>
         <w:t>Appendix B: Additional Tables and Figures</w:t>
       </w:r>
@@ -26399,7 +26407,7 @@
       <w:r>
         <w:fldChar w:fldCharType="end"/>
       </w:r>
-      <w:bookmarkStart w:id="105" w:name="_Toc16939"/>
+      <w:bookmarkStart w:id="105" w:name="_Toc11722"/>
       <w:r>
         <w:t>: Data dictionary of the raw billing extract</w:t>
       </w:r>
@@ -29936,7 +29944,7 @@
       <w:r>
         <w:fldChar w:fldCharType="end"/>
       </w:r>
-      <w:bookmarkStart w:id="106" w:name="_Toc25660"/>
+      <w:bookmarkStart w:id="106" w:name="_Toc2629"/>
       <w:r>
         <w:t>: Weekly WAPE (%) by backtest fold (fold start date shown)</w:t>
       </w:r>
@@ -33079,7 +33087,7 @@
       <w:r>
         <w:fldChar w:fldCharType="end"/>
       </w:r>
-      <w:bookmarkStart w:id="107" w:name="_Toc25367"/>
+      <w:bookmarkStart w:id="107" w:name="_Toc13203"/>
       <w:r>
         <w:t>: Weekly WAPE (%) by demand class and forecast horizon</w:t>
       </w:r>
@@ -36203,7 +36211,7 @@
       <w:pPr>
         <w:pStyle w:val="3"/>
       </w:pPr>
-      <w:bookmarkStart w:id="108" w:name="_Toc2005"/>
+      <w:bookmarkStart w:id="108" w:name="_Toc11786"/>
       <w:r>
         <w:t>Appendix C: Code and Reproducibility</w:t>
       </w:r>
@@ -36280,7 +36288,7 @@
       <w:pPr>
         <w:pStyle w:val="2"/>
       </w:pPr>
-      <w:bookmarkStart w:id="109" w:name="_Toc9947"/>
+      <w:bookmarkStart w:id="109" w:name="_Toc29992"/>
       <w:r>
         <w:t>About the Authors</w:t>
       </w:r>
@@ -36673,11 +36681,7 @@
         </w:tc>
       </w:tr>
     </w:tbl>
-    <w:p>
-      <w:r>
-        <w:t>[Team to add one line of professional background for each author if opting in to book-chapter consideration; otherwise this section may be removed.]</w:t>
-      </w:r>
-    </w:p>
+    <w:p/>
     <w:sectPr>
       <w:headerReference r:id="rId9" w:type="default"/>
       <w:footerReference r:id="rId10" w:type="default"/>
@@ -37186,9 +37190,9 @@
     <w:lsdException w:uiPriority="99" w:name="index 7"/>
     <w:lsdException w:uiPriority="99" w:name="index 8"/>
     <w:lsdException w:uiPriority="99" w:name="index 9"/>
-    <w:lsdException w:unhideWhenUsed="0" w:uiPriority="39" w:semiHidden="0" w:name="toc 1"/>
+    <w:lsdException w:qFormat="1" w:unhideWhenUsed="0" w:uiPriority="39" w:semiHidden="0" w:name="toc 1"/>
     <w:lsdException w:qFormat="1" w:unhideWhenUsed="0" w:uiPriority="39" w:semiHidden="0" w:name="toc 2"/>
-    <w:lsdException w:unhideWhenUsed="0" w:uiPriority="39" w:semiHidden="0" w:name="toc 3"/>
+    <w:lsdException w:qFormat="1" w:unhideWhenUsed="0" w:uiPriority="39" w:semiHidden="0" w:name="toc 3"/>
     <w:lsdException w:uiPriority="39" w:name="toc 4"/>
     <w:lsdException w:uiPriority="39" w:name="toc 5"/>
     <w:lsdException w:uiPriority="39" w:name="toc 6"/>
@@ -37196,7 +37200,7 @@
     <w:lsdException w:uiPriority="39" w:name="toc 8"/>
     <w:lsdException w:uiPriority="39" w:name="toc 9"/>
     <w:lsdException w:uiPriority="99" w:name="Normal Indent"/>
-    <w:lsdException w:uiPriority="99" w:name="footnote text"/>
+    <w:lsdException w:qFormat="1" w:uiPriority="99" w:name="footnote text"/>
     <w:lsdException w:uiPriority="99" w:name="annotation text"/>
     <w:lsdException w:uiPriority="99" w:name="header"/>
     <w:lsdException w:uiPriority="99" w:name="footer"/>
@@ -37209,7 +37213,7 @@
     <w:lsdException w:uiPriority="99" w:name="annotation reference"/>
     <w:lsdException w:uiPriority="99" w:name="line number"/>
     <w:lsdException w:uiPriority="99" w:name="page number"/>
-    <w:lsdException w:qFormat="1" w:uiPriority="99" w:name="endnote reference"/>
+    <w:lsdException w:uiPriority="99" w:name="endnote reference"/>
     <w:lsdException w:qFormat="1" w:uiPriority="99" w:name="endnote text"/>
     <w:lsdException w:uiPriority="99" w:name="table of authorities"/>
     <w:lsdException w:uiPriority="99" w:name="macro"/>
@@ -37592,7 +37596,6 @@
     <w:name w:val="endnote reference"/>
     <w:semiHidden/>
     <w:unhideWhenUsed/>
-    <w:qFormat/>
     <w:uiPriority w:val="99"/>
     <w:rPr>
       <w:vertAlign w:val="superscript"/>
@@ -37629,6 +37632,7 @@
     <w:link w:val="23"/>
     <w:semiHidden/>
     <w:unhideWhenUsed/>
+    <w:qFormat/>
     <w:uiPriority w:val="99"/>
     <w:pPr>
       <w:spacing w:after="0" w:line="240" w:lineRule="auto"/>
@@ -37673,6 +37677,7 @@
     <w:name w:val="toc 1"/>
     <w:basedOn w:val="1"/>
     <w:next w:val="1"/>
+    <w:qFormat/>
     <w:uiPriority w:val="39"/>
     <w:pPr>
       <w:spacing w:before="100" w:after="20" w:line="264" w:lineRule="auto"/>
@@ -37700,6 +37705,7 @@
     <w:name w:val="toc 3"/>
     <w:basedOn w:val="1"/>
     <w:next w:val="1"/>
+    <w:qFormat/>
     <w:uiPriority w:val="39"/>
     <w:pPr>
       <w:spacing w:after="20" w:line="264" w:lineRule="auto"/>
@@ -37734,7 +37740,6 @@
     <w:link w:val="14"/>
     <w:semiHidden/>
     <w:unhideWhenUsed/>
-    <w:qFormat/>
     <w:uiPriority w:val="99"/>
     <w:rPr>
       <w:sz w:val="20"/>
@@ -37746,6 +37751,7 @@
     <w:link w:val="12"/>
     <w:semiHidden/>
     <w:unhideWhenUsed/>
+    <w:qFormat/>
     <w:uiPriority w:val="99"/>
     <w:rPr>
       <w:sz w:val="20"/>
@@ -37756,6 +37762,7 @@
     <w:name w:val="Source Note"/>
     <w:basedOn w:val="1"/>
     <w:next w:val="1"/>
+    <w:qFormat/>
     <w:uiPriority w:val="0"/>
     <w:pPr>
       <w:spacing w:after="200" w:line="240" w:lineRule="auto"/>
@@ -37772,6 +37779,7 @@
   <w:style w:type="paragraph" w:customStyle="1" w:styleId="26">
     <w:name w:val="Table Text"/>
     <w:basedOn w:val="1"/>
+    <w:qFormat/>
     <w:uiPriority w:val="0"/>
     <w:pPr>
       <w:spacing w:after="40" w:line="252" w:lineRule="auto"/>
@@ -37803,6 +37811,7 @@
   <w:style w:type="paragraph" w:customStyle="1" w:styleId="28">
     <w:name w:val="Box Title"/>
     <w:basedOn w:val="1"/>
+    <w:qFormat/>
     <w:uiPriority w:val="0"/>
     <w:pPr>
       <w:keepNext/>
@@ -37819,7 +37828,6 @@
   <w:style w:type="paragraph" w:customStyle="1" w:styleId="29">
     <w:name w:val="Box Text"/>
     <w:basedOn w:val="1"/>
-    <w:qFormat/>
     <w:uiPriority w:val="0"/>
     <w:pPr>
       <w:spacing w:after="60" w:line="264" w:lineRule="auto"/>

</xml_diff>